<commit_message>
Update DOCX in output/paper_insert_package
Modify binary .docx file in output/paper_insert_package/20260417_001308 — the Word document was updated (binary diff). This is a regenerated/updated document; no source code changes.
</commit_message>
<xml_diff>
--- a/output/paper_insert_package/20260417_001308/最新版论文4.16_插图版.docx
+++ b/output/paper_insert_package/20260417_001308/最新版论文4.16_插图版.docx
@@ -417,7 +417,7 @@
       <w:pPr>
         <w:pStyle w:val="1"/>
         <w:rPr>
-          <w:rFonts w:ascii="宋体" w:hAnsi="宋体"/>
+          <w:rFonts w:ascii="宋体" w:hAnsi="宋体" w:hint="eastAsia"/>
           <w:lang w:eastAsia="zh-CN"/>
         </w:rPr>
       </w:pPr>
@@ -1193,32 +1193,51 @@
         <w:jc w:val="center"/>
       </w:pPr>
       <w:r>
+        <w:rPr>
+          <w:noProof/>
+        </w:rPr>
         <w:drawing>
-          <wp:inline xmlns:a="http://schemas.openxmlformats.org/drawingml/2006/main" xmlns:pic="http://schemas.openxmlformats.org/drawingml/2006/picture">
-            <wp:extent cx="5832000" cy="2891513"/>
-            <wp:docPr id="6" name="Picture 6"/>
+          <wp:inline distT="0" distB="0" distL="0" distR="0" wp14:anchorId="21E71BB7" wp14:editId="1D9578BF">
+            <wp:extent cx="6400800" cy="3139440"/>
+            <wp:effectExtent l="0" t="0" r="0" b="3810"/>
+            <wp:docPr id="269004910" name="图片 1"/>
             <wp:cNvGraphicFramePr>
-              <a:graphicFrameLocks noChangeAspect="1"/>
+              <a:graphicFrameLocks xmlns:a="http://schemas.openxmlformats.org/drawingml/2006/main" noChangeAspect="1"/>
             </wp:cNvGraphicFramePr>
-            <a:graphic>
+            <a:graphic xmlns:a="http://schemas.openxmlformats.org/drawingml/2006/main">
               <a:graphicData uri="http://schemas.openxmlformats.org/drawingml/2006/picture">
-                <pic:pic>
+                <pic:pic xmlns:pic="http://schemas.openxmlformats.org/drawingml/2006/picture">
                   <pic:nvPicPr>
-                    <pic:cNvPr id="0" name="01-覆岩扰动约束机理示意图.png"/>
-                    <pic:cNvPicPr/>
+                    <pic:cNvPr id="0" name="Picture 1"/>
+                    <pic:cNvPicPr>
+                      <a:picLocks noChangeAspect="1" noChangeArrowheads="1"/>
+                    </pic:cNvPicPr>
                   </pic:nvPicPr>
                   <pic:blipFill>
-                    <a:blip r:embed="rId11"/>
+                    <a:blip r:embed="rId8">
+                      <a:extLst>
+                        <a:ext uri="{28A0092B-C50C-407E-A947-70E740481C1C}">
+                          <a14:useLocalDpi xmlns:a14="http://schemas.microsoft.com/office/drawing/2010/main" val="0"/>
+                        </a:ext>
+                      </a:extLst>
+                    </a:blip>
+                    <a:srcRect/>
                     <a:stretch>
                       <a:fillRect/>
                     </a:stretch>
                   </pic:blipFill>
-                  <pic:spPr>
+                  <pic:spPr bwMode="auto">
                     <a:xfrm>
                       <a:off x="0" y="0"/>
-                      <a:ext cx="5832000" cy="2891513"/>
+                      <a:ext cx="6400800" cy="3139440"/>
                     </a:xfrm>
-                    <a:prstGeom prst="rect"/>
+                    <a:prstGeom prst="rect">
+                      <a:avLst/>
+                    </a:prstGeom>
+                    <a:noFill/>
+                    <a:ln>
+                      <a:noFill/>
+                    </a:ln>
                   </pic:spPr>
                 </pic:pic>
               </a:graphicData>
@@ -1230,13 +1249,35 @@
     <w:p>
       <w:pPr>
         <w:jc w:val="center"/>
+        <w:rPr>
+          <w:lang w:eastAsia="zh-CN"/>
+        </w:rPr>
       </w:pPr>
       <w:r>
         <w:rPr>
-          <w:b w:val="0"/>
-          <w:sz w:val="21"/>
-        </w:rPr>
-        <w:t>图1 覆岩扰动约束机理示意图</w:t>
+          <w:lang w:eastAsia="zh-CN"/>
+        </w:rPr>
+        <w:t>图</w:t>
+      </w:r>
+      <w:r>
+        <w:rPr>
+          <w:lang w:eastAsia="zh-CN"/>
+        </w:rPr>
+        <w:t xml:space="preserve">1 </w:t>
+      </w:r>
+      <w:proofErr w:type="gramStart"/>
+      <w:r>
+        <w:rPr>
+          <w:lang w:eastAsia="zh-CN"/>
+        </w:rPr>
+        <w:t>覆岩扰动</w:t>
+      </w:r>
+      <w:proofErr w:type="gramEnd"/>
+      <w:r>
+        <w:rPr>
+          <w:lang w:eastAsia="zh-CN"/>
+        </w:rPr>
+        <w:t>约束机理示意图</w:t>
       </w:r>
     </w:p>
     <w:p>
@@ -1721,6 +1762,7 @@
         <w:rPr>
           <w:lang w:eastAsia="zh-CN"/>
         </w:rPr>
+        <w:lastRenderedPageBreak/>
         <w:t>式中，</w:t>
       </w:r>
       <m:oMath>
@@ -2670,7 +2712,6 @@
         <w:rPr>
           <w:lang w:eastAsia="zh-CN"/>
         </w:rPr>
-        <w:lastRenderedPageBreak/>
         <w:t>式中，</w:t>
       </w:r>
       <m:oMath>
@@ -4324,7 +4365,14 @@
         <w:rPr>
           <w:lang w:eastAsia="zh-CN"/>
         </w:rPr>
-        <w:t>加权插值思想，其目的并不在于追求复杂模型形式，而在于为采区规划提供连续、可计算、可传递的地质参数底图。</w:t>
+        <w:t>加权插值思想，其目的并不在于追求复杂模型形式，而在</w:t>
+      </w:r>
+      <w:r>
+        <w:rPr>
+          <w:lang w:eastAsia="zh-CN"/>
+        </w:rPr>
+        <w:lastRenderedPageBreak/>
+        <w:t>于为采区规划提供连续、可计算、可传递的地质参数底图。</w:t>
       </w:r>
       <w:proofErr w:type="gramStart"/>
       <w:r>
@@ -5113,7 +5161,6 @@
           <w:rFonts w:ascii="宋体" w:hAnsi="宋体"/>
           <w:lang w:eastAsia="zh-CN"/>
         </w:rPr>
-        <w:lastRenderedPageBreak/>
         <w:t>并满足</w:t>
       </w:r>
     </w:p>
@@ -5390,7 +5437,6 @@
       <w:pPr>
         <w:pStyle w:val="21"/>
         <w:rPr>
-          <w:rFonts w:hint="eastAsia"/>
           <w:lang w:eastAsia="zh-CN"/>
         </w:rPr>
       </w:pPr>
@@ -5470,7 +5516,15 @@
           <w:rFonts w:ascii="宋体" w:hAnsi="宋体"/>
           <w:lang w:eastAsia="zh-CN"/>
         </w:rPr>
-        <w:t>值和超限比例的变化，识别对扰动强度最敏感的控制量，并据此开展局部优化。这意味着规划阶段并不直接产出不可更改的</w:t>
+        <w:t>值和超限比例的变化，识别对扰动强度最敏感的控制量，并据此开展局部优化。这意味着规划阶段并不</w:t>
+      </w:r>
+      <w:r>
+        <w:rPr>
+          <w:rFonts w:ascii="宋体" w:hAnsi="宋体"/>
+          <w:lang w:eastAsia="zh-CN"/>
+        </w:rPr>
+        <w:lastRenderedPageBreak/>
+        <w:t>直接产出不可更改的</w:t>
       </w:r>
       <w:proofErr w:type="gramStart"/>
       <w:r>
@@ -7131,7 +7185,6 @@
         <w:rPr>
           <w:lang w:eastAsia="zh-CN"/>
         </w:rPr>
-        <w:lastRenderedPageBreak/>
         <w:t>因此，本文方法可以概括为：以有效布置域和连续</w:t>
       </w:r>
       <w:proofErr w:type="gramStart"/>
@@ -7455,22 +7508,27 @@
         <w:jc w:val="center"/>
       </w:pPr>
       <w:r>
+        <w:rPr>
+          <w:noProof/>
+        </w:rPr>
+        <w:lastRenderedPageBreak/>
         <w:drawing>
-          <wp:inline xmlns:a="http://schemas.openxmlformats.org/drawingml/2006/main" xmlns:pic="http://schemas.openxmlformats.org/drawingml/2006/picture">
+          <wp:inline distT="0" distB="0" distL="0" distR="0" wp14:anchorId="19C01E49" wp14:editId="7A56A019">
             <wp:extent cx="5616000" cy="3460045"/>
+            <wp:effectExtent l="0" t="0" r="0" b="0"/>
             <wp:docPr id="7" name="Picture 7"/>
             <wp:cNvGraphicFramePr>
-              <a:graphicFrameLocks noChangeAspect="1"/>
+              <a:graphicFrameLocks xmlns:a="http://schemas.openxmlformats.org/drawingml/2006/main" noChangeAspect="1"/>
             </wp:cNvGraphicFramePr>
-            <a:graphic>
+            <a:graphic xmlns:a="http://schemas.openxmlformats.org/drawingml/2006/main">
               <a:graphicData uri="http://schemas.openxmlformats.org/drawingml/2006/picture">
-                <pic:pic>
+                <pic:pic xmlns:pic="http://schemas.openxmlformats.org/drawingml/2006/picture">
                   <pic:nvPicPr>
                     <pic:cNvPr id="0" name="02-研究区钻孔空间分布图.png"/>
                     <pic:cNvPicPr/>
                   </pic:nvPicPr>
                   <pic:blipFill>
-                    <a:blip r:embed="rId12"/>
+                    <a:blip r:embed="rId9"/>
                     <a:stretch>
                       <a:fillRect/>
                     </a:stretch>
@@ -7480,7 +7538,9 @@
                       <a:off x="0" y="0"/>
                       <a:ext cx="5616000" cy="3460045"/>
                     </a:xfrm>
-                    <a:prstGeom prst="rect"/>
+                    <a:prstGeom prst="rect">
+                      <a:avLst/>
+                    </a:prstGeom>
                   </pic:spPr>
                 </pic:pic>
               </a:graphicData>
@@ -7492,13 +7552,27 @@
     <w:p>
       <w:pPr>
         <w:jc w:val="center"/>
+        <w:rPr>
+          <w:lang w:eastAsia="zh-CN"/>
+        </w:rPr>
       </w:pPr>
       <w:r>
         <w:rPr>
-          <w:b w:val="0"/>
-          <w:sz w:val="21"/>
-        </w:rPr>
-        <w:t>图2 研究区钻孔空间分布图</w:t>
+          <w:lang w:eastAsia="zh-CN"/>
+        </w:rPr>
+        <w:t>图</w:t>
+      </w:r>
+      <w:r>
+        <w:rPr>
+          <w:lang w:eastAsia="zh-CN"/>
+        </w:rPr>
+        <w:t xml:space="preserve">2 </w:t>
+      </w:r>
+      <w:r>
+        <w:rPr>
+          <w:lang w:eastAsia="zh-CN"/>
+        </w:rPr>
+        <w:t>研究区钻孔空间分布图</w:t>
       </w:r>
     </w:p>
     <w:p>
@@ -8527,6 +8601,7 @@
               <w:rPr>
                 <w:lang w:eastAsia="zh-CN"/>
               </w:rPr>
+              <w:lastRenderedPageBreak/>
               <w:t>几何约束</w:t>
             </w:r>
           </w:p>
@@ -8685,7 +8760,6 @@
               <w:rPr>
                 <w:lang w:eastAsia="zh-CN"/>
               </w:rPr>
-              <w:lastRenderedPageBreak/>
               <w:t>几何约束</w:t>
             </w:r>
           </w:p>
@@ -10147,7 +10221,6 @@
         <w:spacing w:after="40"/>
         <w:ind w:firstLine="420"/>
         <w:rPr>
-          <w:rFonts w:hint="eastAsia"/>
           <w:lang w:eastAsia="zh-CN"/>
         </w:rPr>
       </w:pPr>
@@ -10208,22 +10281,27 @@
         <w:jc w:val="center"/>
       </w:pPr>
       <w:r>
+        <w:rPr>
+          <w:noProof/>
+        </w:rPr>
+        <w:lastRenderedPageBreak/>
         <w:drawing>
-          <wp:inline xmlns:a="http://schemas.openxmlformats.org/drawingml/2006/main" xmlns:pic="http://schemas.openxmlformats.org/drawingml/2006/picture">
+          <wp:inline distT="0" distB="0" distL="0" distR="0" wp14:anchorId="6848C728" wp14:editId="4B0D2EE9">
             <wp:extent cx="5868000" cy="4546571"/>
+            <wp:effectExtent l="0" t="0" r="0" b="0"/>
             <wp:docPr id="8" name="Picture 8"/>
             <wp:cNvGraphicFramePr>
-              <a:graphicFrameLocks noChangeAspect="1"/>
+              <a:graphicFrameLocks xmlns:a="http://schemas.openxmlformats.org/drawingml/2006/main" noChangeAspect="1"/>
             </wp:cNvGraphicFramePr>
-            <a:graphic>
+            <a:graphic xmlns:a="http://schemas.openxmlformats.org/drawingml/2006/main">
               <a:graphicData uri="http://schemas.openxmlformats.org/drawingml/2006/picture">
-                <pic:pic>
+                <pic:pic xmlns:pic="http://schemas.openxmlformats.org/drawingml/2006/picture">
                   <pic:nvPicPr>
                     <pic:cNvPr id="0" name="03-研究区主要地质参数场分布图.png"/>
                     <pic:cNvPicPr/>
                   </pic:nvPicPr>
                   <pic:blipFill>
-                    <a:blip r:embed="rId13"/>
+                    <a:blip r:embed="rId10"/>
                     <a:stretch>
                       <a:fillRect/>
                     </a:stretch>
@@ -10233,7 +10311,9 @@
                       <a:off x="0" y="0"/>
                       <a:ext cx="5868000" cy="4546571"/>
                     </a:xfrm>
-                    <a:prstGeom prst="rect"/>
+                    <a:prstGeom prst="rect">
+                      <a:avLst/>
+                    </a:prstGeom>
                   </pic:spPr>
                 </pic:pic>
               </a:graphicData>
@@ -10245,13 +10325,41 @@
     <w:p>
       <w:pPr>
         <w:jc w:val="center"/>
+        <w:rPr>
+          <w:lang w:eastAsia="zh-CN"/>
+        </w:rPr>
       </w:pPr>
       <w:r>
         <w:rPr>
-          <w:b w:val="0"/>
-          <w:sz w:val="21"/>
-        </w:rPr>
-        <w:t>图3 研究区主要地质参数场分布图</w:t>
+          <w:lang w:eastAsia="zh-CN"/>
+        </w:rPr>
+        <w:t>图</w:t>
+      </w:r>
+      <w:r>
+        <w:rPr>
+          <w:lang w:eastAsia="zh-CN"/>
+        </w:rPr>
+        <w:t xml:space="preserve">3 </w:t>
+      </w:r>
+      <w:r>
+        <w:rPr>
+          <w:lang w:eastAsia="zh-CN"/>
+        </w:rPr>
+        <w:t>研究区主要地质</w:t>
+      </w:r>
+      <w:proofErr w:type="gramStart"/>
+      <w:r>
+        <w:rPr>
+          <w:lang w:eastAsia="zh-CN"/>
+        </w:rPr>
+        <w:t>参数场</w:t>
+      </w:r>
+      <w:proofErr w:type="gramEnd"/>
+      <w:r>
+        <w:rPr>
+          <w:lang w:eastAsia="zh-CN"/>
+        </w:rPr>
+        <w:t>分布图</w:t>
       </w:r>
     </w:p>
     <w:p>
@@ -10493,7 +10601,15 @@
           <w:rFonts w:ascii="宋体" w:hAnsi="宋体" w:hint="eastAsia"/>
           <w:lang w:eastAsia="zh-CN"/>
         </w:rPr>
-        <w:t>风险场</w:t>
+        <w:t>风险</w:t>
+      </w:r>
+      <w:r>
+        <w:rPr>
+          <w:rFonts w:ascii="宋体" w:hAnsi="宋体" w:hint="eastAsia"/>
+          <w:lang w:eastAsia="zh-CN"/>
+        </w:rPr>
+        <w:lastRenderedPageBreak/>
+        <w:t>场</w:t>
       </w:r>
       <w:proofErr w:type="gramEnd"/>
       <w:r>
@@ -10529,7 +10645,6 @@
         <w:rPr>
           <w:noProof/>
         </w:rPr>
-        <w:lastRenderedPageBreak/>
         <w:drawing>
           <wp:inline distT="0" distB="0" distL="0" distR="0" wp14:anchorId="03F3F28F" wp14:editId="40AD04C2">
             <wp:extent cx="5835315" cy="4434839"/>
@@ -10546,7 +10661,7 @@
                     <pic:cNvPicPr/>
                   </pic:nvPicPr>
                   <pic:blipFill>
-                    <a:blip r:embed="rId8"/>
+                    <a:blip r:embed="rId11"/>
                     <a:stretch>
                       <a:fillRect/>
                     </a:stretch>
@@ -10732,22 +10847,27 @@
         <w:jc w:val="center"/>
       </w:pPr>
       <w:r>
+        <w:rPr>
+          <w:noProof/>
+        </w:rPr>
+        <w:lastRenderedPageBreak/>
         <w:drawing>
-          <wp:inline xmlns:a="http://schemas.openxmlformats.org/drawingml/2006/main" xmlns:pic="http://schemas.openxmlformats.org/drawingml/2006/picture">
+          <wp:inline distT="0" distB="0" distL="0" distR="0" wp14:anchorId="53CD7144" wp14:editId="0B7F28A1">
             <wp:extent cx="5940000" cy="1645446"/>
+            <wp:effectExtent l="0" t="0" r="0" b="0"/>
             <wp:docPr id="9" name="Picture 9"/>
             <wp:cNvGraphicFramePr>
-              <a:graphicFrameLocks noChangeAspect="1"/>
+              <a:graphicFrameLocks xmlns:a="http://schemas.openxmlformats.org/drawingml/2006/main" noChangeAspect="1"/>
             </wp:cNvGraphicFramePr>
-            <a:graphic>
+            <a:graphic xmlns:a="http://schemas.openxmlformats.org/drawingml/2006/main">
               <a:graphicData uri="http://schemas.openxmlformats.org/drawingml/2006/picture">
-                <pic:pic>
+                <pic:pic xmlns:pic="http://schemas.openxmlformats.org/drawingml/2006/picture">
                   <pic:nvPicPr>
                     <pic:cNvPr id="0" name="04-多场景ODI分布结果对比图.png"/>
                     <pic:cNvPicPr/>
                   </pic:nvPicPr>
                   <pic:blipFill>
-                    <a:blip r:embed="rId14"/>
+                    <a:blip r:embed="rId12"/>
                     <a:stretch>
                       <a:fillRect/>
                     </a:stretch>
@@ -10757,7 +10877,9 @@
                       <a:off x="0" y="0"/>
                       <a:ext cx="5940000" cy="1645446"/>
                     </a:xfrm>
-                    <a:prstGeom prst="rect"/>
+                    <a:prstGeom prst="rect">
+                      <a:avLst/>
+                    </a:prstGeom>
                   </pic:spPr>
                 </pic:pic>
               </a:graphicData>
@@ -10769,13 +10891,39 @@
     <w:p>
       <w:pPr>
         <w:jc w:val="center"/>
+        <w:rPr>
+          <w:lang w:eastAsia="zh-CN"/>
+        </w:rPr>
       </w:pPr>
       <w:r>
         <w:rPr>
-          <w:b w:val="0"/>
-          <w:sz w:val="21"/>
-        </w:rPr>
-        <w:t>图4 多场景ODI分布结果对比图</w:t>
+          <w:lang w:eastAsia="zh-CN"/>
+        </w:rPr>
+        <w:t>图</w:t>
+      </w:r>
+      <w:r>
+        <w:rPr>
+          <w:lang w:eastAsia="zh-CN"/>
+        </w:rPr>
+        <w:t xml:space="preserve">4 </w:t>
+      </w:r>
+      <w:r>
+        <w:rPr>
+          <w:lang w:eastAsia="zh-CN"/>
+        </w:rPr>
+        <w:t>多场景</w:t>
+      </w:r>
+      <w:r>
+        <w:rPr>
+          <w:lang w:eastAsia="zh-CN"/>
+        </w:rPr>
+        <w:t>ODI</w:t>
+      </w:r>
+      <w:r>
+        <w:rPr>
+          <w:lang w:eastAsia="zh-CN"/>
+        </w:rPr>
+        <w:t>分布结果对比图</w:t>
       </w:r>
     </w:p>
     <w:p>
@@ -10841,7 +10989,6 @@
           <w:rFonts w:ascii="宋体" w:hAnsi="宋体" w:hint="eastAsia"/>
           <w:lang w:eastAsia="zh-CN"/>
         </w:rPr>
-        <w:lastRenderedPageBreak/>
         <w:t>在规划语境下，ODI 的价值主要体现在两个层面。首先，它能够对研究区进行高扰动敏感区与相对有利区划分，为工作面初始布局提供空间边界。对 ODI 值较高且连续成片的区域，可在候选方案生成阶段提高约束强度，必要时直接排除；对 ODI 值较低或处于可控范围内的区域，则可作为候选布置的优先空间。其次，ODI 能够为</w:t>
       </w:r>
       <w:proofErr w:type="gramStart"/>
@@ -10882,7 +11029,7 @@
         <w:spacing w:after="40"/>
         <w:ind w:firstLine="420"/>
         <w:rPr>
-          <w:rFonts w:ascii="宋体" w:hAnsi="宋体"/>
+          <w:rFonts w:ascii="宋体" w:hAnsi="宋体" w:hint="eastAsia"/>
           <w:lang w:eastAsia="zh-CN"/>
         </w:rPr>
       </w:pPr>
@@ -11019,7 +11166,7 @@
             <w:pPr>
               <w:spacing w:after="40"/>
               <w:rPr>
-                <w:rFonts w:ascii="宋体" w:hAnsi="宋体"/>
+                <w:rFonts w:ascii="宋体" w:hAnsi="宋体" w:hint="eastAsia"/>
                 <w:b/>
                 <w:bCs/>
                 <w:lang w:eastAsia="zh-CN"/>
@@ -11050,7 +11197,7 @@
             <w:pPr>
               <w:spacing w:after="40"/>
               <w:rPr>
-                <w:rFonts w:ascii="宋体" w:hAnsi="宋体"/>
+                <w:rFonts w:ascii="宋体" w:hAnsi="宋体" w:hint="eastAsia"/>
                 <w:b/>
                 <w:bCs/>
                 <w:lang w:eastAsia="zh-CN"/>
@@ -11081,7 +11228,7 @@
             <w:pPr>
               <w:spacing w:after="40"/>
               <w:rPr>
-                <w:rFonts w:ascii="宋体" w:hAnsi="宋体"/>
+                <w:rFonts w:ascii="宋体" w:hAnsi="宋体" w:hint="eastAsia"/>
                 <w:b/>
                 <w:bCs/>
                 <w:lang w:eastAsia="zh-CN"/>
@@ -11112,7 +11259,7 @@
             <w:pPr>
               <w:spacing w:after="40"/>
               <w:rPr>
-                <w:rFonts w:ascii="宋体" w:hAnsi="宋体"/>
+                <w:rFonts w:ascii="宋体" w:hAnsi="宋体" w:hint="eastAsia"/>
                 <w:b/>
                 <w:bCs/>
                 <w:lang w:eastAsia="zh-CN"/>
@@ -11145,7 +11292,7 @@
             <w:pPr>
               <w:spacing w:after="40"/>
               <w:rPr>
-                <w:rFonts w:ascii="宋体" w:hAnsi="宋体"/>
+                <w:rFonts w:ascii="宋体" w:hAnsi="宋体" w:hint="eastAsia"/>
                 <w:lang w:eastAsia="zh-CN"/>
               </w:rPr>
             </w:pPr>
@@ -11168,7 +11315,7 @@
             <w:pPr>
               <w:spacing w:after="40"/>
               <w:rPr>
-                <w:rFonts w:ascii="宋体" w:hAnsi="宋体"/>
+                <w:rFonts w:ascii="宋体" w:hAnsi="宋体" w:hint="eastAsia"/>
                 <w:lang w:eastAsia="zh-CN"/>
               </w:rPr>
             </w:pPr>
@@ -11191,7 +11338,7 @@
             <w:pPr>
               <w:spacing w:after="40"/>
               <w:rPr>
-                <w:rFonts w:ascii="宋体" w:hAnsi="宋体"/>
+                <w:rFonts w:ascii="宋体" w:hAnsi="宋体" w:hint="eastAsia"/>
                 <w:lang w:eastAsia="zh-CN"/>
               </w:rPr>
             </w:pPr>
@@ -11214,7 +11361,7 @@
             <w:pPr>
               <w:spacing w:after="40"/>
               <w:rPr>
-                <w:rFonts w:ascii="宋体" w:hAnsi="宋体"/>
+                <w:rFonts w:ascii="宋体" w:hAnsi="宋体" w:hint="eastAsia"/>
                 <w:lang w:eastAsia="zh-CN"/>
               </w:rPr>
             </w:pPr>
@@ -11243,7 +11390,7 @@
             <w:pPr>
               <w:spacing w:after="40"/>
               <w:rPr>
-                <w:rFonts w:ascii="宋体" w:hAnsi="宋体"/>
+                <w:rFonts w:ascii="宋体" w:hAnsi="宋体" w:hint="eastAsia"/>
                 <w:lang w:eastAsia="zh-CN"/>
               </w:rPr>
             </w:pPr>
@@ -11266,7 +11413,7 @@
             <w:pPr>
               <w:spacing w:after="40"/>
               <w:rPr>
-                <w:rFonts w:ascii="宋体" w:hAnsi="宋体"/>
+                <w:rFonts w:ascii="宋体" w:hAnsi="宋体" w:hint="eastAsia"/>
                 <w:lang w:eastAsia="zh-CN"/>
               </w:rPr>
             </w:pPr>
@@ -11289,7 +11436,7 @@
             <w:pPr>
               <w:spacing w:after="40"/>
               <w:rPr>
-                <w:rFonts w:ascii="宋体" w:hAnsi="宋体"/>
+                <w:rFonts w:ascii="宋体" w:hAnsi="宋体" w:hint="eastAsia"/>
                 <w:lang w:eastAsia="zh-CN"/>
               </w:rPr>
             </w:pPr>
@@ -11328,7 +11475,7 @@
             <w:pPr>
               <w:spacing w:after="40"/>
               <w:rPr>
-                <w:rFonts w:ascii="宋体" w:hAnsi="宋体"/>
+                <w:rFonts w:ascii="宋体" w:hAnsi="宋体" w:hint="eastAsia"/>
                 <w:lang w:eastAsia="zh-CN"/>
               </w:rPr>
             </w:pPr>
@@ -11373,7 +11520,7 @@
             <w:pPr>
               <w:spacing w:after="40"/>
               <w:rPr>
-                <w:rFonts w:ascii="宋体" w:hAnsi="宋体"/>
+                <w:rFonts w:ascii="宋体" w:hAnsi="宋体" w:hint="eastAsia"/>
                 <w:lang w:eastAsia="zh-CN"/>
               </w:rPr>
             </w:pPr>
@@ -11396,7 +11543,7 @@
             <w:pPr>
               <w:spacing w:after="40"/>
               <w:rPr>
-                <w:rFonts w:ascii="宋体" w:hAnsi="宋体"/>
+                <w:rFonts w:ascii="宋体" w:hAnsi="宋体" w:hint="eastAsia"/>
                 <w:lang w:eastAsia="zh-CN"/>
               </w:rPr>
             </w:pPr>
@@ -11419,7 +11566,7 @@
             <w:pPr>
               <w:spacing w:after="40"/>
               <w:rPr>
-                <w:rFonts w:ascii="宋体" w:hAnsi="宋体"/>
+                <w:rFonts w:ascii="宋体" w:hAnsi="宋体" w:hint="eastAsia"/>
                 <w:lang w:eastAsia="zh-CN"/>
               </w:rPr>
             </w:pPr>
@@ -11458,7 +11605,7 @@
             <w:pPr>
               <w:spacing w:after="40"/>
               <w:rPr>
-                <w:rFonts w:ascii="宋体" w:hAnsi="宋体"/>
+                <w:rFonts w:ascii="宋体" w:hAnsi="宋体" w:hint="eastAsia"/>
                 <w:lang w:eastAsia="zh-CN"/>
               </w:rPr>
             </w:pPr>
@@ -11487,7 +11634,7 @@
             <w:pPr>
               <w:spacing w:after="40"/>
               <w:rPr>
-                <w:rFonts w:ascii="宋体" w:hAnsi="宋体"/>
+                <w:rFonts w:ascii="宋体" w:hAnsi="宋体" w:hint="eastAsia"/>
                 <w:lang w:eastAsia="zh-CN"/>
               </w:rPr>
             </w:pPr>
@@ -11510,7 +11657,7 @@
             <w:pPr>
               <w:spacing w:after="40"/>
               <w:rPr>
-                <w:rFonts w:ascii="宋体" w:hAnsi="宋体"/>
+                <w:rFonts w:ascii="宋体" w:hAnsi="宋体" w:hint="eastAsia"/>
                 <w:lang w:eastAsia="zh-CN"/>
               </w:rPr>
             </w:pPr>
@@ -11533,7 +11680,7 @@
             <w:pPr>
               <w:spacing w:after="40"/>
               <w:rPr>
-                <w:rFonts w:ascii="宋体" w:hAnsi="宋体"/>
+                <w:rFonts w:ascii="宋体" w:hAnsi="宋体" w:hint="eastAsia"/>
                 <w:lang w:eastAsia="zh-CN"/>
               </w:rPr>
             </w:pPr>
@@ -11572,7 +11719,7 @@
             <w:pPr>
               <w:spacing w:after="40"/>
               <w:rPr>
-                <w:rFonts w:ascii="宋体" w:hAnsi="宋体"/>
+                <w:rFonts w:ascii="宋体" w:hAnsi="宋体" w:hint="eastAsia"/>
                 <w:lang w:eastAsia="zh-CN"/>
               </w:rPr>
             </w:pPr>
@@ -11737,7 +11884,15 @@
           <w:rFonts w:ascii="宋体" w:hAnsi="宋体"/>
           <w:lang w:eastAsia="zh-CN"/>
         </w:rPr>
-        <w:t>优先和综合权衡优化4种规划模式。四种模式并非4套彼此独立的算法，而是面向同一候选方案池的不同评价视角，其目的在于为采区规划提供可比、可选和</w:t>
+        <w:t>优先</w:t>
+      </w:r>
+      <w:r>
+        <w:rPr>
+          <w:rFonts w:ascii="宋体" w:hAnsi="宋体"/>
+          <w:lang w:eastAsia="zh-CN"/>
+        </w:rPr>
+        <w:lastRenderedPageBreak/>
+        <w:t>和综合权衡优化4种规划模式。四种模式并非4套彼此独立的算法，而是面向同一候选方案池的不同评价视角，其目的在于为采区规划提供可比、可选和</w:t>
       </w:r>
       <w:proofErr w:type="gramStart"/>
       <w:r>
@@ -11761,18 +11916,473 @@
         <w:jc w:val="center"/>
       </w:pPr>
       <w:r>
+        <w:rPr>
+          <w:noProof/>
+        </w:rPr>
         <w:drawing>
-          <wp:inline xmlns:a="http://schemas.openxmlformats.org/drawingml/2006/main" xmlns:pic="http://schemas.openxmlformats.org/drawingml/2006/picture">
+          <wp:inline distT="0" distB="0" distL="0" distR="0" wp14:anchorId="284663AF" wp14:editId="2F6AF715">
             <wp:extent cx="5688000" cy="3543965"/>
+            <wp:effectExtent l="0" t="0" r="0" b="0"/>
             <wp:docPr id="10" name="Picture 10"/>
             <wp:cNvGraphicFramePr>
-              <a:graphicFrameLocks noChangeAspect="1"/>
+              <a:graphicFrameLocks xmlns:a="http://schemas.openxmlformats.org/drawingml/2006/main" noChangeAspect="1"/>
             </wp:cNvGraphicFramePr>
-            <a:graphic>
+            <a:graphic xmlns:a="http://schemas.openxmlformats.org/drawingml/2006/main">
               <a:graphicData uri="http://schemas.openxmlformats.org/drawingml/2006/picture">
-                <pic:pic>
+                <pic:pic xmlns:pic="http://schemas.openxmlformats.org/drawingml/2006/picture">
                   <pic:nvPicPr>
                     <pic:cNvPr id="0" name="05-含水层扰动约束下最终规划布局与ODI场叠置图.png"/>
+                    <pic:cNvPicPr/>
+                  </pic:nvPicPr>
+                  <pic:blipFill>
+                    <a:blip r:embed="rId13"/>
+                    <a:stretch>
+                      <a:fillRect/>
+                    </a:stretch>
+                  </pic:blipFill>
+                  <pic:spPr>
+                    <a:xfrm>
+                      <a:off x="0" y="0"/>
+                      <a:ext cx="5688000" cy="3543965"/>
+                    </a:xfrm>
+                    <a:prstGeom prst="rect">
+                      <a:avLst/>
+                    </a:prstGeom>
+                  </pic:spPr>
+                </pic:pic>
+              </a:graphicData>
+            </a:graphic>
+          </wp:inline>
+        </w:drawing>
+      </w:r>
+    </w:p>
+    <w:p>
+      <w:pPr>
+        <w:jc w:val="center"/>
+        <w:rPr>
+          <w:lang w:eastAsia="zh-CN"/>
+        </w:rPr>
+      </w:pPr>
+      <w:r>
+        <w:rPr>
+          <w:lang w:eastAsia="zh-CN"/>
+        </w:rPr>
+        <w:t>图</w:t>
+      </w:r>
+      <w:r>
+        <w:rPr>
+          <w:lang w:eastAsia="zh-CN"/>
+        </w:rPr>
+        <w:t xml:space="preserve">5 </w:t>
+      </w:r>
+      <w:r>
+        <w:rPr>
+          <w:lang w:eastAsia="zh-CN"/>
+        </w:rPr>
+        <w:t>含水层扰动约束下最终规划布局与</w:t>
+      </w:r>
+      <w:r>
+        <w:rPr>
+          <w:lang w:eastAsia="zh-CN"/>
+        </w:rPr>
+        <w:t>ODI</w:t>
+      </w:r>
+      <w:r>
+        <w:rPr>
+          <w:lang w:eastAsia="zh-CN"/>
+        </w:rPr>
+        <w:t>场叠置图</w:t>
+      </w:r>
+    </w:p>
+    <w:p>
+      <w:pPr>
+        <w:spacing w:after="40"/>
+        <w:ind w:firstLine="420"/>
+        <w:rPr>
+          <w:rFonts w:ascii="宋体" w:hAnsi="宋体" w:hint="eastAsia"/>
+          <w:lang w:eastAsia="zh-CN"/>
+        </w:rPr>
+      </w:pPr>
+      <w:r>
+        <w:rPr>
+          <w:rFonts w:ascii="宋体" w:hAnsi="宋体"/>
+          <w:lang w:eastAsia="zh-CN"/>
+        </w:rPr>
+        <w:t>从样例结果看，在研究区约束条件下，规划模块能够完成工作面与巷道的结构化输出，</w:t>
+      </w:r>
+      <w:proofErr w:type="gramStart"/>
+      <w:r>
+        <w:rPr>
+          <w:rFonts w:ascii="宋体" w:hAnsi="宋体"/>
+          <w:lang w:eastAsia="zh-CN"/>
+        </w:rPr>
+        <w:t>当前样</w:t>
+      </w:r>
+      <w:proofErr w:type="gramEnd"/>
+      <w:r>
+        <w:rPr>
+          <w:rFonts w:ascii="宋体" w:hAnsi="宋体"/>
+          <w:lang w:eastAsia="zh-CN"/>
+        </w:rPr>
+        <w:t>例共生成3个工作面和11条巷道。该结果表明，所提方法已经具备将采区边界、钻孔样点、连续</w:t>
+      </w:r>
+      <w:proofErr w:type="gramStart"/>
+      <w:r>
+        <w:rPr>
+          <w:rFonts w:ascii="宋体" w:hAnsi="宋体"/>
+          <w:lang w:eastAsia="zh-CN"/>
+        </w:rPr>
+        <w:t>参数场</w:t>
+      </w:r>
+      <w:proofErr w:type="gramEnd"/>
+      <w:r>
+        <w:rPr>
+          <w:rFonts w:ascii="宋体" w:hAnsi="宋体"/>
+          <w:lang w:eastAsia="zh-CN"/>
+        </w:rPr>
+        <w:t>与 ODI 约束共同转化为可布置空间对象的能力。更重要的是，这些对象并不是零散图元，而是可继续参与接续分析与经济评价的结构化规划结果。对论文而言，这一结果说明本文所提方法已不再停留于</w:t>
+      </w:r>
+      <w:proofErr w:type="gramStart"/>
+      <w:r>
+        <w:rPr>
+          <w:rFonts w:ascii="宋体" w:hAnsi="宋体"/>
+          <w:lang w:eastAsia="zh-CN"/>
+        </w:rPr>
+        <w:t>参数场或风险场</w:t>
+      </w:r>
+      <w:proofErr w:type="gramEnd"/>
+      <w:r>
+        <w:rPr>
+          <w:rFonts w:ascii="宋体" w:hAnsi="宋体"/>
+          <w:lang w:eastAsia="zh-CN"/>
+        </w:rPr>
+        <w:t>的中间计算阶段，而是能够落到采区规划</w:t>
+      </w:r>
+      <w:proofErr w:type="gramStart"/>
+      <w:r>
+        <w:rPr>
+          <w:rFonts w:ascii="宋体" w:hAnsi="宋体"/>
+          <w:lang w:eastAsia="zh-CN"/>
+        </w:rPr>
+        <w:t>最</w:t>
+      </w:r>
+      <w:proofErr w:type="gramEnd"/>
+      <w:r>
+        <w:rPr>
+          <w:rFonts w:ascii="宋体" w:hAnsi="宋体"/>
+          <w:lang w:eastAsia="zh-CN"/>
+        </w:rPr>
+        <w:t>核心的空间对象生成环节。</w:t>
+      </w:r>
+    </w:p>
+    <w:p>
+      <w:pPr>
+        <w:spacing w:after="40"/>
+        <w:ind w:firstLine="420"/>
+        <w:rPr>
+          <w:rFonts w:ascii="宋体" w:hAnsi="宋体" w:hint="eastAsia"/>
+          <w:lang w:eastAsia="zh-CN"/>
+        </w:rPr>
+      </w:pPr>
+      <w:r>
+        <w:rPr>
+          <w:rFonts w:ascii="宋体" w:hAnsi="宋体"/>
+          <w:lang w:eastAsia="zh-CN"/>
+        </w:rPr>
+        <w:t>从布局结果本身看，工作面与巷道对象并不是直接贴附在原始边界外轮廓上的简单几何划分，而是在有效布置域内形成必要的保护距离和工程边界。这意味着采区边界在规划语境中不能简单理解为“外轮廓包络”，而应理解为“原始边界经煤柱约束、保护条件和几何合法性处理后的可布置范围”。换言之，规划模块不是直接在静态图形上作图，而是在约束条件、</w:t>
+      </w:r>
+      <w:proofErr w:type="gramStart"/>
+      <w:r>
+        <w:rPr>
+          <w:rFonts w:ascii="宋体" w:hAnsi="宋体"/>
+          <w:lang w:eastAsia="zh-CN"/>
+        </w:rPr>
+        <w:t>参数场和风险场</w:t>
+      </w:r>
+      <w:proofErr w:type="gramEnd"/>
+      <w:r>
+        <w:rPr>
+          <w:rFonts w:ascii="宋体" w:hAnsi="宋体"/>
+          <w:lang w:eastAsia="zh-CN"/>
+        </w:rPr>
+        <w:t>共同作用下形成具有工程语义的空间对象集合。</w:t>
+      </w:r>
+    </w:p>
+    <w:p>
+      <w:pPr>
+        <w:jc w:val="center"/>
+      </w:pPr>
+      <w:r>
+        <w:rPr>
+          <w:noProof/>
+        </w:rPr>
+        <w:lastRenderedPageBreak/>
+        <w:drawing>
+          <wp:inline distT="0" distB="0" distL="0" distR="0" wp14:anchorId="3595B78C" wp14:editId="4BAF444F">
+            <wp:extent cx="5688000" cy="3362181"/>
+            <wp:effectExtent l="0" t="0" r="0" b="0"/>
+            <wp:docPr id="11" name="Picture 11"/>
+            <wp:cNvGraphicFramePr>
+              <a:graphicFrameLocks xmlns:a="http://schemas.openxmlformats.org/drawingml/2006/main" noChangeAspect="1"/>
+            </wp:cNvGraphicFramePr>
+            <a:graphic xmlns:a="http://schemas.openxmlformats.org/drawingml/2006/main">
+              <a:graphicData uri="http://schemas.openxmlformats.org/drawingml/2006/picture">
+                <pic:pic xmlns:pic="http://schemas.openxmlformats.org/drawingml/2006/picture">
+                  <pic:nvPicPr>
+                    <pic:cNvPr id="0" name="06-采区规划布局结果图.png"/>
+                    <pic:cNvPicPr/>
+                  </pic:nvPicPr>
+                  <pic:blipFill>
+                    <a:blip r:embed="rId14"/>
+                    <a:stretch>
+                      <a:fillRect/>
+                    </a:stretch>
+                  </pic:blipFill>
+                  <pic:spPr>
+                    <a:xfrm>
+                      <a:off x="0" y="0"/>
+                      <a:ext cx="5688000" cy="3362181"/>
+                    </a:xfrm>
+                    <a:prstGeom prst="rect">
+                      <a:avLst/>
+                    </a:prstGeom>
+                  </pic:spPr>
+                </pic:pic>
+              </a:graphicData>
+            </a:graphic>
+          </wp:inline>
+        </w:drawing>
+      </w:r>
+    </w:p>
+    <w:p>
+      <w:pPr>
+        <w:jc w:val="center"/>
+        <w:rPr>
+          <w:lang w:eastAsia="zh-CN"/>
+        </w:rPr>
+      </w:pPr>
+      <w:r>
+        <w:rPr>
+          <w:lang w:eastAsia="zh-CN"/>
+        </w:rPr>
+        <w:t>图</w:t>
+      </w:r>
+      <w:r>
+        <w:rPr>
+          <w:lang w:eastAsia="zh-CN"/>
+        </w:rPr>
+        <w:t xml:space="preserve">6 </w:t>
+      </w:r>
+      <w:r>
+        <w:rPr>
+          <w:lang w:eastAsia="zh-CN"/>
+        </w:rPr>
+        <w:t>采区规划布局结果图</w:t>
+      </w:r>
+    </w:p>
+    <w:p>
+      <w:pPr>
+        <w:pStyle w:val="21"/>
+        <w:rPr>
+          <w:lang w:eastAsia="zh-CN"/>
+        </w:rPr>
+      </w:pPr>
+      <w:r>
+        <w:rPr>
+          <w:rFonts w:hint="eastAsia"/>
+          <w:lang w:eastAsia="zh-CN"/>
+        </w:rPr>
+        <w:t>3</w:t>
+      </w:r>
+      <w:r>
+        <w:rPr>
+          <w:lang w:eastAsia="zh-CN"/>
+        </w:rPr>
+        <w:t xml:space="preserve">.2 </w:t>
+      </w:r>
+      <w:proofErr w:type="gramStart"/>
+      <w:r>
+        <w:rPr>
+          <w:lang w:eastAsia="zh-CN"/>
+        </w:rPr>
+        <w:t>四模式</w:t>
+      </w:r>
+      <w:proofErr w:type="gramEnd"/>
+      <w:r>
+        <w:rPr>
+          <w:lang w:eastAsia="zh-CN"/>
+        </w:rPr>
+        <w:t>候选规划与方案比选</w:t>
+      </w:r>
+    </w:p>
+    <w:p>
+      <w:pPr>
+        <w:spacing w:after="40"/>
+        <w:ind w:firstLine="420"/>
+        <w:rPr>
+          <w:rFonts w:ascii="宋体" w:hAnsi="宋体" w:hint="eastAsia"/>
+          <w:lang w:eastAsia="zh-CN"/>
+        </w:rPr>
+      </w:pPr>
+      <w:r>
+        <w:rPr>
+          <w:rFonts w:ascii="宋体" w:hAnsi="宋体" w:hint="eastAsia"/>
+          <w:lang w:eastAsia="zh-CN"/>
+        </w:rPr>
+        <w:t>从</w:t>
+      </w:r>
+      <w:proofErr w:type="gramStart"/>
+      <w:r>
+        <w:rPr>
+          <w:rFonts w:ascii="宋体" w:hAnsi="宋体" w:hint="eastAsia"/>
+          <w:lang w:eastAsia="zh-CN"/>
+        </w:rPr>
+        <w:t>四模式</w:t>
+      </w:r>
+      <w:proofErr w:type="gramEnd"/>
+      <w:r>
+        <w:rPr>
+          <w:rFonts w:ascii="宋体" w:hAnsi="宋体" w:hint="eastAsia"/>
+          <w:lang w:eastAsia="zh-CN"/>
+        </w:rPr>
+        <w:t>的含义看，工程效率优先模式更强调工作面连续性、巷道组织便利性和几何可实施性，适用于优先保证布置效率与施工便利的决策场景；资源回收优先模式在</w:t>
+      </w:r>
+      <w:proofErr w:type="gramStart"/>
+      <w:r>
+        <w:rPr>
+          <w:rFonts w:ascii="宋体" w:hAnsi="宋体" w:hint="eastAsia"/>
+          <w:lang w:eastAsia="zh-CN"/>
+        </w:rPr>
+        <w:t>参数场</w:t>
+      </w:r>
+      <w:proofErr w:type="gramEnd"/>
+      <w:r>
+        <w:rPr>
+          <w:rFonts w:ascii="宋体" w:hAnsi="宋体" w:hint="eastAsia"/>
+          <w:lang w:eastAsia="zh-CN"/>
+        </w:rPr>
+        <w:t>基础上强化厚度分布与可采价值较高区域的优先级，更适用于强调资源利用水平的情形；</w:t>
+      </w:r>
+      <w:proofErr w:type="gramStart"/>
+      <w:r>
+        <w:rPr>
+          <w:rFonts w:ascii="宋体" w:hAnsi="宋体" w:hint="eastAsia"/>
+          <w:lang w:eastAsia="zh-CN"/>
+        </w:rPr>
+        <w:t>覆岩扰动</w:t>
+      </w:r>
+      <w:proofErr w:type="gramEnd"/>
+      <w:r>
+        <w:rPr>
+          <w:rFonts w:ascii="宋体" w:hAnsi="宋体" w:hint="eastAsia"/>
+          <w:lang w:eastAsia="zh-CN"/>
+        </w:rPr>
+        <w:t>优先模式则以 ODI 均值、</w:t>
+      </w:r>
+      <w:proofErr w:type="gramStart"/>
+      <w:r>
+        <w:rPr>
+          <w:rFonts w:ascii="宋体" w:hAnsi="宋体" w:hint="eastAsia"/>
+          <w:lang w:eastAsia="zh-CN"/>
+        </w:rPr>
+        <w:t>高分位</w:t>
+      </w:r>
+      <w:proofErr w:type="gramEnd"/>
+      <w:r>
+        <w:rPr>
+          <w:rFonts w:ascii="宋体" w:hAnsi="宋体" w:hint="eastAsia"/>
+          <w:lang w:eastAsia="zh-CN"/>
+        </w:rPr>
+        <w:t>值及超限暴露比例等指标为核心，倾向于降低规划对象在高风险区内的暴露程度；综合权衡模式则在上述3类目标之间进行统一权衡，更接近工程实践中多目标并行比较、人工与算法协同决策的实际需求。4种模式的设置使规划结果不再是“唯一答案”，而成为满足不同偏好的候选方案集合。</w:t>
+      </w:r>
+    </w:p>
+    <w:p>
+      <w:pPr>
+        <w:spacing w:after="40"/>
+        <w:ind w:firstLine="420"/>
+        <w:rPr>
+          <w:rFonts w:ascii="宋体" w:hAnsi="宋体" w:hint="eastAsia"/>
+          <w:lang w:eastAsia="zh-CN"/>
+        </w:rPr>
+      </w:pPr>
+      <w:r>
+        <w:rPr>
+          <w:rFonts w:ascii="宋体" w:hAnsi="宋体" w:hint="eastAsia"/>
+          <w:lang w:eastAsia="zh-CN"/>
+        </w:rPr>
+        <w:t>从</w:t>
+      </w:r>
+      <w:proofErr w:type="gramStart"/>
+      <w:r>
+        <w:rPr>
+          <w:rFonts w:ascii="宋体" w:hAnsi="宋体" w:hint="eastAsia"/>
+          <w:lang w:eastAsia="zh-CN"/>
+        </w:rPr>
+        <w:t>当前样</w:t>
+      </w:r>
+      <w:proofErr w:type="gramEnd"/>
+      <w:r>
+        <w:rPr>
+          <w:rFonts w:ascii="宋体" w:hAnsi="宋体" w:hint="eastAsia"/>
+          <w:lang w:eastAsia="zh-CN"/>
+        </w:rPr>
+        <w:t>例的验证口径看，本文更强调</w:t>
+      </w:r>
+      <w:proofErr w:type="gramStart"/>
+      <w:r>
+        <w:rPr>
+          <w:rFonts w:ascii="宋体" w:hAnsi="宋体" w:hint="eastAsia"/>
+          <w:lang w:eastAsia="zh-CN"/>
+        </w:rPr>
+        <w:t>四模式</w:t>
+      </w:r>
+      <w:proofErr w:type="gramEnd"/>
+      <w:r>
+        <w:rPr>
+          <w:rFonts w:ascii="宋体" w:hAnsi="宋体" w:hint="eastAsia"/>
+          <w:lang w:eastAsia="zh-CN"/>
+        </w:rPr>
+        <w:t>规划“可形成、可比较、可解释”，而不是急于给出某一模式在真实矿井条件下绝对最优的结论。现阶段结果已经足以说明：在统一候选池上，通过调整工程效率、资源回收与扰动控制的权重，规划结果能够呈现出具有差异性的目标侧重和空间组织特征。这意味着所提方法不仅能够生成方案，还能够为不同目标偏好下的决策提供明确的比较框架。对于</w:t>
+      </w:r>
+      <w:proofErr w:type="gramStart"/>
+      <w:r>
+        <w:rPr>
+          <w:rFonts w:ascii="宋体" w:hAnsi="宋体" w:hint="eastAsia"/>
+          <w:lang w:eastAsia="zh-CN"/>
+        </w:rPr>
+        <w:t>偏工程</w:t>
+      </w:r>
+      <w:proofErr w:type="gramEnd"/>
+      <w:r>
+        <w:rPr>
+          <w:rFonts w:ascii="宋体" w:hAnsi="宋体" w:hint="eastAsia"/>
+          <w:lang w:eastAsia="zh-CN"/>
+        </w:rPr>
+        <w:t>方法与应用验证的论文而言，这种“多方案可比较”的组织方式比单一静态方案更具说服力。</w:t>
+      </w:r>
+    </w:p>
+    <w:p>
+      <w:pPr>
+        <w:jc w:val="center"/>
+      </w:pPr>
+      <w:r>
+        <w:rPr>
+          <w:noProof/>
+        </w:rPr>
+        <w:lastRenderedPageBreak/>
+        <w:drawing>
+          <wp:inline distT="0" distB="0" distL="0" distR="0" wp14:anchorId="1DDC6B5C" wp14:editId="2C0F680A">
+            <wp:extent cx="5544000" cy="3406819"/>
+            <wp:effectExtent l="0" t="0" r="0" b="0"/>
+            <wp:docPr id="12" name="Picture 12"/>
+            <wp:cNvGraphicFramePr>
+              <a:graphicFrameLocks xmlns:a="http://schemas.openxmlformats.org/drawingml/2006/main" noChangeAspect="1"/>
+            </wp:cNvGraphicFramePr>
+            <a:graphic xmlns:a="http://schemas.openxmlformats.org/drawingml/2006/main">
+              <a:graphicData uri="http://schemas.openxmlformats.org/drawingml/2006/picture">
+                <pic:pic xmlns:pic="http://schemas.openxmlformats.org/drawingml/2006/picture">
+                  <pic:nvPicPr>
+                    <pic:cNvPr id="0" name="07-四模式规划指标对比图.png"/>
                     <pic:cNvPicPr/>
                   </pic:nvPicPr>
                   <pic:blipFill>
@@ -11784,9 +12394,11 @@
                   <pic:spPr>
                     <a:xfrm>
                       <a:off x="0" y="0"/>
-                      <a:ext cx="5688000" cy="3543965"/>
+                      <a:ext cx="5544000" cy="3406819"/>
                     </a:xfrm>
-                    <a:prstGeom prst="rect"/>
+                    <a:prstGeom prst="rect">
+                      <a:avLst/>
+                    </a:prstGeom>
                   </pic:spPr>
                 </pic:pic>
               </a:graphicData>
@@ -11798,13 +12410,35 @@
     <w:p>
       <w:pPr>
         <w:jc w:val="center"/>
+        <w:rPr>
+          <w:lang w:eastAsia="zh-CN"/>
+        </w:rPr>
       </w:pPr>
       <w:r>
         <w:rPr>
-          <w:b w:val="0"/>
-          <w:sz w:val="21"/>
-        </w:rPr>
-        <w:t>图5 含水层扰动约束下最终规划布局与ODI场叠置图</w:t>
+          <w:lang w:eastAsia="zh-CN"/>
+        </w:rPr>
+        <w:t>图</w:t>
+      </w:r>
+      <w:r>
+        <w:rPr>
+          <w:lang w:eastAsia="zh-CN"/>
+        </w:rPr>
+        <w:t xml:space="preserve">7 </w:t>
+      </w:r>
+      <w:proofErr w:type="gramStart"/>
+      <w:r>
+        <w:rPr>
+          <w:lang w:eastAsia="zh-CN"/>
+        </w:rPr>
+        <w:t>四模式</w:t>
+      </w:r>
+      <w:proofErr w:type="gramEnd"/>
+      <w:r>
+        <w:rPr>
+          <w:lang w:eastAsia="zh-CN"/>
+        </w:rPr>
+        <w:t>规划指标对比图</w:t>
       </w:r>
     </w:p>
     <w:p>
@@ -11813,411 +12447,6 @@
         <w:ind w:firstLine="420"/>
         <w:rPr>
           <w:rFonts w:ascii="宋体" w:hAnsi="宋体" w:hint="eastAsia"/>
-          <w:lang w:eastAsia="zh-CN"/>
-        </w:rPr>
-      </w:pPr>
-      <w:r>
-        <w:rPr>
-          <w:rFonts w:ascii="宋体" w:hAnsi="宋体"/>
-          <w:lang w:eastAsia="zh-CN"/>
-        </w:rPr>
-        <w:t>从样例结果看，在研究区约束条件下，规划模块能够完成工作面与巷道的结构化输出，</w:t>
-      </w:r>
-      <w:proofErr w:type="gramStart"/>
-      <w:r>
-        <w:rPr>
-          <w:rFonts w:ascii="宋体" w:hAnsi="宋体"/>
-          <w:lang w:eastAsia="zh-CN"/>
-        </w:rPr>
-        <w:t>当前样</w:t>
-      </w:r>
-      <w:proofErr w:type="gramEnd"/>
-      <w:r>
-        <w:rPr>
-          <w:rFonts w:ascii="宋体" w:hAnsi="宋体"/>
-          <w:lang w:eastAsia="zh-CN"/>
-        </w:rPr>
-        <w:t>例共生成3个工作面和11条巷道。该结果表明，所提方法已经具备将采区边界、钻孔样点、连续</w:t>
-      </w:r>
-      <w:proofErr w:type="gramStart"/>
-      <w:r>
-        <w:rPr>
-          <w:rFonts w:ascii="宋体" w:hAnsi="宋体"/>
-          <w:lang w:eastAsia="zh-CN"/>
-        </w:rPr>
-        <w:t>参数场</w:t>
-      </w:r>
-      <w:proofErr w:type="gramEnd"/>
-      <w:r>
-        <w:rPr>
-          <w:rFonts w:ascii="宋体" w:hAnsi="宋体"/>
-          <w:lang w:eastAsia="zh-CN"/>
-        </w:rPr>
-        <w:t>与 ODI 约束共同转化为可布置空间对象的能力。更重要的是，这些对象并不是零散图元，而是可继续参与接续分析与经济评价的结构化规划结果。对论文而言，这一结果说明本文所提方法已不再停留于</w:t>
-      </w:r>
-      <w:proofErr w:type="gramStart"/>
-      <w:r>
-        <w:rPr>
-          <w:rFonts w:ascii="宋体" w:hAnsi="宋体"/>
-          <w:lang w:eastAsia="zh-CN"/>
-        </w:rPr>
-        <w:t>参数场或风险场</w:t>
-      </w:r>
-      <w:proofErr w:type="gramEnd"/>
-      <w:r>
-        <w:rPr>
-          <w:rFonts w:ascii="宋体" w:hAnsi="宋体"/>
-          <w:lang w:eastAsia="zh-CN"/>
-        </w:rPr>
-        <w:t>的中间计算阶段，而是能够落到采区规划</w:t>
-      </w:r>
-      <w:proofErr w:type="gramStart"/>
-      <w:r>
-        <w:rPr>
-          <w:rFonts w:ascii="宋体" w:hAnsi="宋体"/>
-          <w:lang w:eastAsia="zh-CN"/>
-        </w:rPr>
-        <w:t>最</w:t>
-      </w:r>
-      <w:proofErr w:type="gramEnd"/>
-      <w:r>
-        <w:rPr>
-          <w:rFonts w:ascii="宋体" w:hAnsi="宋体"/>
-          <w:lang w:eastAsia="zh-CN"/>
-        </w:rPr>
-        <w:t>核心的空间对象生成环节。</w:t>
-      </w:r>
-    </w:p>
-    <w:p>
-      <w:pPr>
-        <w:spacing w:after="40"/>
-        <w:ind w:firstLine="420"/>
-        <w:rPr>
-          <w:rFonts w:ascii="宋体" w:hAnsi="宋体" w:hint="eastAsia"/>
-          <w:lang w:eastAsia="zh-CN"/>
-        </w:rPr>
-      </w:pPr>
-      <w:r>
-        <w:rPr>
-          <w:rFonts w:ascii="宋体" w:hAnsi="宋体"/>
-          <w:lang w:eastAsia="zh-CN"/>
-        </w:rPr>
-        <w:t>从布局结果本身看，工作面与巷道对象并不是直接贴附在原始边界外轮廓上的简单几何划分，而是在有效布置域内形成必要的保护距离和工程边界。这意味着采区边界在规划语境中不能简单理解为“外轮廓包络”，而应理解为“原始边界经煤柱约束、保护条件和几何合法性处理后的可布置范围”。换言之，规划模块不是直接在静态图形上作图，而是在约束条件、</w:t>
-      </w:r>
-      <w:proofErr w:type="gramStart"/>
-      <w:r>
-        <w:rPr>
-          <w:rFonts w:ascii="宋体" w:hAnsi="宋体"/>
-          <w:lang w:eastAsia="zh-CN"/>
-        </w:rPr>
-        <w:t>参数场和风险场</w:t>
-      </w:r>
-      <w:proofErr w:type="gramEnd"/>
-      <w:r>
-        <w:rPr>
-          <w:rFonts w:ascii="宋体" w:hAnsi="宋体"/>
-          <w:lang w:eastAsia="zh-CN"/>
-        </w:rPr>
-        <w:t>共同作用下形成具有工程语义的空间对象集合。</w:t>
-      </w:r>
-    </w:p>
-    <w:p>
-      <w:pPr>
-        <w:jc w:val="center"/>
-      </w:pPr>
-      <w:r>
-        <w:drawing>
-          <wp:inline xmlns:a="http://schemas.openxmlformats.org/drawingml/2006/main" xmlns:pic="http://schemas.openxmlformats.org/drawingml/2006/picture">
-            <wp:extent cx="5688000" cy="3362181"/>
-            <wp:docPr id="11" name="Picture 11"/>
-            <wp:cNvGraphicFramePr>
-              <a:graphicFrameLocks noChangeAspect="1"/>
-            </wp:cNvGraphicFramePr>
-            <a:graphic>
-              <a:graphicData uri="http://schemas.openxmlformats.org/drawingml/2006/picture">
-                <pic:pic>
-                  <pic:nvPicPr>
-                    <pic:cNvPr id="0" name="06-采区规划布局结果图.png"/>
-                    <pic:cNvPicPr/>
-                  </pic:nvPicPr>
-                  <pic:blipFill>
-                    <a:blip r:embed="rId16"/>
-                    <a:stretch>
-                      <a:fillRect/>
-                    </a:stretch>
-                  </pic:blipFill>
-                  <pic:spPr>
-                    <a:xfrm>
-                      <a:off x="0" y="0"/>
-                      <a:ext cx="5688000" cy="3362181"/>
-                    </a:xfrm>
-                    <a:prstGeom prst="rect"/>
-                  </pic:spPr>
-                </pic:pic>
-              </a:graphicData>
-            </a:graphic>
-          </wp:inline>
-        </w:drawing>
-      </w:r>
-    </w:p>
-    <w:p>
-      <w:pPr>
-        <w:jc w:val="center"/>
-      </w:pPr>
-      <w:r>
-        <w:rPr>
-          <w:b w:val="0"/>
-          <w:sz w:val="21"/>
-        </w:rPr>
-        <w:t>图6 采区规划布局结果图</w:t>
-      </w:r>
-    </w:p>
-    <w:p>
-      <w:pPr>
-        <w:pStyle w:val="21"/>
-        <w:rPr>
-          <w:lang w:eastAsia="zh-CN"/>
-        </w:rPr>
-      </w:pPr>
-      <w:r>
-        <w:rPr>
-          <w:rFonts w:hint="eastAsia"/>
-          <w:lang w:eastAsia="zh-CN"/>
-        </w:rPr>
-        <w:t>3</w:t>
-      </w:r>
-      <w:r>
-        <w:rPr>
-          <w:lang w:eastAsia="zh-CN"/>
-        </w:rPr>
-        <w:t xml:space="preserve">.2 </w:t>
-      </w:r>
-      <w:proofErr w:type="gramStart"/>
-      <w:r>
-        <w:rPr>
-          <w:lang w:eastAsia="zh-CN"/>
-        </w:rPr>
-        <w:t>四模式</w:t>
-      </w:r>
-      <w:proofErr w:type="gramEnd"/>
-      <w:r>
-        <w:rPr>
-          <w:lang w:eastAsia="zh-CN"/>
-        </w:rPr>
-        <w:t>候选规划与方案比选</w:t>
-      </w:r>
-    </w:p>
-    <w:p>
-      <w:pPr>
-        <w:spacing w:after="40"/>
-        <w:ind w:firstLine="420"/>
-        <w:rPr>
-          <w:rFonts w:ascii="宋体" w:hAnsi="宋体" w:hint="eastAsia"/>
-          <w:lang w:eastAsia="zh-CN"/>
-        </w:rPr>
-      </w:pPr>
-      <w:r>
-        <w:rPr>
-          <w:rFonts w:ascii="宋体" w:hAnsi="宋体" w:hint="eastAsia"/>
-          <w:lang w:eastAsia="zh-CN"/>
-        </w:rPr>
-        <w:t>从</w:t>
-      </w:r>
-      <w:proofErr w:type="gramStart"/>
-      <w:r>
-        <w:rPr>
-          <w:rFonts w:ascii="宋体" w:hAnsi="宋体" w:hint="eastAsia"/>
-          <w:lang w:eastAsia="zh-CN"/>
-        </w:rPr>
-        <w:t>四模式</w:t>
-      </w:r>
-      <w:proofErr w:type="gramEnd"/>
-      <w:r>
-        <w:rPr>
-          <w:rFonts w:ascii="宋体" w:hAnsi="宋体" w:hint="eastAsia"/>
-          <w:lang w:eastAsia="zh-CN"/>
-        </w:rPr>
-        <w:t>的含义看，工程效率优先模式更强调工作面连续性、巷道组织便利性和几何可实施性，适用于优先保证布置效率与施工便利的决策场景；资源回收优先模式在</w:t>
-      </w:r>
-      <w:proofErr w:type="gramStart"/>
-      <w:r>
-        <w:rPr>
-          <w:rFonts w:ascii="宋体" w:hAnsi="宋体" w:hint="eastAsia"/>
-          <w:lang w:eastAsia="zh-CN"/>
-        </w:rPr>
-        <w:t>参数场</w:t>
-      </w:r>
-      <w:proofErr w:type="gramEnd"/>
-      <w:r>
-        <w:rPr>
-          <w:rFonts w:ascii="宋体" w:hAnsi="宋体" w:hint="eastAsia"/>
-          <w:lang w:eastAsia="zh-CN"/>
-        </w:rPr>
-        <w:t>基础上强化厚度分布与可采价值较高区域的优先级，更适用于强调资源利用水平的情形；</w:t>
-      </w:r>
-      <w:proofErr w:type="gramStart"/>
-      <w:r>
-        <w:rPr>
-          <w:rFonts w:ascii="宋体" w:hAnsi="宋体" w:hint="eastAsia"/>
-          <w:lang w:eastAsia="zh-CN"/>
-        </w:rPr>
-        <w:t>覆岩扰动</w:t>
-      </w:r>
-      <w:proofErr w:type="gramEnd"/>
-      <w:r>
-        <w:rPr>
-          <w:rFonts w:ascii="宋体" w:hAnsi="宋体" w:hint="eastAsia"/>
-          <w:lang w:eastAsia="zh-CN"/>
-        </w:rPr>
-        <w:t>优先模式则以 ODI 均值、</w:t>
-      </w:r>
-      <w:proofErr w:type="gramStart"/>
-      <w:r>
-        <w:rPr>
-          <w:rFonts w:ascii="宋体" w:hAnsi="宋体" w:hint="eastAsia"/>
-          <w:lang w:eastAsia="zh-CN"/>
-        </w:rPr>
-        <w:t>高分位</w:t>
-      </w:r>
-      <w:proofErr w:type="gramEnd"/>
-      <w:r>
-        <w:rPr>
-          <w:rFonts w:ascii="宋体" w:hAnsi="宋体" w:hint="eastAsia"/>
-          <w:lang w:eastAsia="zh-CN"/>
-        </w:rPr>
-        <w:t>值及超限暴露比例等指标为核心，倾向于降低规划对象在高风险区内的暴露程度；综合权衡模式则在上述3类目标之间进行统一</w:t>
-      </w:r>
-      <w:r>
-        <w:rPr>
-          <w:rFonts w:ascii="宋体" w:hAnsi="宋体" w:hint="eastAsia"/>
-          <w:lang w:eastAsia="zh-CN"/>
-        </w:rPr>
-        <w:lastRenderedPageBreak/>
-        <w:t>权衡，更接近工程实践中多目标并行比较、人工与算法协同决策的实际需求。4种模式的设置使规划结果不再是“唯一答案”，而成为满足不同偏好的候选方案集合。</w:t>
-      </w:r>
-    </w:p>
-    <w:p>
-      <w:pPr>
-        <w:spacing w:after="40"/>
-        <w:ind w:firstLine="420"/>
-        <w:rPr>
-          <w:rFonts w:ascii="宋体" w:hAnsi="宋体" w:hint="eastAsia"/>
-          <w:lang w:eastAsia="zh-CN"/>
-        </w:rPr>
-      </w:pPr>
-      <w:r>
-        <w:rPr>
-          <w:rFonts w:ascii="宋体" w:hAnsi="宋体" w:hint="eastAsia"/>
-          <w:lang w:eastAsia="zh-CN"/>
-        </w:rPr>
-        <w:t>从</w:t>
-      </w:r>
-      <w:proofErr w:type="gramStart"/>
-      <w:r>
-        <w:rPr>
-          <w:rFonts w:ascii="宋体" w:hAnsi="宋体" w:hint="eastAsia"/>
-          <w:lang w:eastAsia="zh-CN"/>
-        </w:rPr>
-        <w:t>当前样</w:t>
-      </w:r>
-      <w:proofErr w:type="gramEnd"/>
-      <w:r>
-        <w:rPr>
-          <w:rFonts w:ascii="宋体" w:hAnsi="宋体" w:hint="eastAsia"/>
-          <w:lang w:eastAsia="zh-CN"/>
-        </w:rPr>
-        <w:t>例的验证口径看，本文更强调</w:t>
-      </w:r>
-      <w:proofErr w:type="gramStart"/>
-      <w:r>
-        <w:rPr>
-          <w:rFonts w:ascii="宋体" w:hAnsi="宋体" w:hint="eastAsia"/>
-          <w:lang w:eastAsia="zh-CN"/>
-        </w:rPr>
-        <w:t>四模式</w:t>
-      </w:r>
-      <w:proofErr w:type="gramEnd"/>
-      <w:r>
-        <w:rPr>
-          <w:rFonts w:ascii="宋体" w:hAnsi="宋体" w:hint="eastAsia"/>
-          <w:lang w:eastAsia="zh-CN"/>
-        </w:rPr>
-        <w:t>规划“可形成、可比较、可解释”，而不是急于给出某一模式在真实矿井条件下绝对最优的结论。现阶段结果已经足以说明：在统一候选池上，通过调整工程效率、资源回收与扰动控制的权重，规划结果能够呈现出具有差异性的目标侧重和空间组织特征。这意味着所提方法不仅能够生成方案，还能够为不同目标偏好下的决策提供明确的比较框架。对于</w:t>
-      </w:r>
-      <w:proofErr w:type="gramStart"/>
-      <w:r>
-        <w:rPr>
-          <w:rFonts w:ascii="宋体" w:hAnsi="宋体" w:hint="eastAsia"/>
-          <w:lang w:eastAsia="zh-CN"/>
-        </w:rPr>
-        <w:t>偏工程</w:t>
-      </w:r>
-      <w:proofErr w:type="gramEnd"/>
-      <w:r>
-        <w:rPr>
-          <w:rFonts w:ascii="宋体" w:hAnsi="宋体" w:hint="eastAsia"/>
-          <w:lang w:eastAsia="zh-CN"/>
-        </w:rPr>
-        <w:t>方法与应用验证的论文而言，这种“多方案可比较”的组织方式比单一静态方案更具说服力。</w:t>
-      </w:r>
-    </w:p>
-    <w:p>
-      <w:pPr>
-        <w:jc w:val="center"/>
-      </w:pPr>
-      <w:r>
-        <w:drawing>
-          <wp:inline xmlns:a="http://schemas.openxmlformats.org/drawingml/2006/main" xmlns:pic="http://schemas.openxmlformats.org/drawingml/2006/picture">
-            <wp:extent cx="5544000" cy="3406819"/>
-            <wp:docPr id="12" name="Picture 12"/>
-            <wp:cNvGraphicFramePr>
-              <a:graphicFrameLocks noChangeAspect="1"/>
-            </wp:cNvGraphicFramePr>
-            <a:graphic>
-              <a:graphicData uri="http://schemas.openxmlformats.org/drawingml/2006/picture">
-                <pic:pic>
-                  <pic:nvPicPr>
-                    <pic:cNvPr id="0" name="07-四模式规划指标对比图.png"/>
-                    <pic:cNvPicPr/>
-                  </pic:nvPicPr>
-                  <pic:blipFill>
-                    <a:blip r:embed="rId17"/>
-                    <a:stretch>
-                      <a:fillRect/>
-                    </a:stretch>
-                  </pic:blipFill>
-                  <pic:spPr>
-                    <a:xfrm>
-                      <a:off x="0" y="0"/>
-                      <a:ext cx="5544000" cy="3406819"/>
-                    </a:xfrm>
-                    <a:prstGeom prst="rect"/>
-                  </pic:spPr>
-                </pic:pic>
-              </a:graphicData>
-            </a:graphic>
-          </wp:inline>
-        </w:drawing>
-      </w:r>
-    </w:p>
-    <w:p>
-      <w:pPr>
-        <w:jc w:val="center"/>
-      </w:pPr>
-      <w:r>
-        <w:rPr>
-          <w:b w:val="0"/>
-          <w:sz w:val="21"/>
-        </w:rPr>
-        <w:t>图7 四模式规划指标对比图</w:t>
-      </w:r>
-    </w:p>
-    <w:p>
-      <w:pPr>
-        <w:spacing w:after="40"/>
-        <w:ind w:firstLine="420"/>
-        <w:rPr>
-          <w:rFonts w:ascii="宋体" w:hAnsi="宋体"/>
           <w:lang w:eastAsia="zh-CN"/>
         </w:rPr>
       </w:pPr>
@@ -12317,7 +12546,7 @@
             <w:pPr>
               <w:spacing w:after="40"/>
               <w:rPr>
-                <w:rFonts w:ascii="宋体" w:hAnsi="宋体"/>
+                <w:rFonts w:ascii="宋体" w:hAnsi="宋体" w:hint="eastAsia"/>
                 <w:b/>
                 <w:bCs/>
                 <w:lang w:eastAsia="zh-CN"/>
@@ -12348,7 +12577,7 @@
             <w:pPr>
               <w:spacing w:after="40"/>
               <w:rPr>
-                <w:rFonts w:ascii="宋体" w:hAnsi="宋体"/>
+                <w:rFonts w:ascii="宋体" w:hAnsi="宋体" w:hint="eastAsia"/>
                 <w:b/>
                 <w:bCs/>
                 <w:lang w:eastAsia="zh-CN"/>
@@ -12390,7 +12619,7 @@
             <w:pPr>
               <w:spacing w:after="40"/>
               <w:rPr>
-                <w:rFonts w:ascii="宋体" w:hAnsi="宋体"/>
+                <w:rFonts w:ascii="宋体" w:hAnsi="宋体" w:hint="eastAsia"/>
                 <w:b/>
                 <w:bCs/>
                 <w:lang w:eastAsia="zh-CN"/>
@@ -12421,7 +12650,7 @@
             <w:pPr>
               <w:spacing w:after="40"/>
               <w:rPr>
-                <w:rFonts w:ascii="宋体" w:hAnsi="宋体"/>
+                <w:rFonts w:ascii="宋体" w:hAnsi="宋体" w:hint="eastAsia"/>
                 <w:b/>
                 <w:bCs/>
                 <w:lang w:eastAsia="zh-CN"/>
@@ -12452,7 +12681,7 @@
             <w:pPr>
               <w:spacing w:after="40"/>
               <w:rPr>
-                <w:rFonts w:ascii="宋体" w:hAnsi="宋体"/>
+                <w:rFonts w:ascii="宋体" w:hAnsi="宋体" w:hint="eastAsia"/>
                 <w:b/>
                 <w:bCs/>
                 <w:lang w:eastAsia="zh-CN"/>
@@ -12483,7 +12712,7 @@
             <w:pPr>
               <w:spacing w:after="40"/>
               <w:rPr>
-                <w:rFonts w:ascii="宋体" w:hAnsi="宋体"/>
+                <w:rFonts w:ascii="宋体" w:hAnsi="宋体" w:hint="eastAsia"/>
                 <w:b/>
                 <w:bCs/>
                 <w:lang w:eastAsia="zh-CN"/>
@@ -12514,7 +12743,7 @@
             <w:pPr>
               <w:spacing w:after="40"/>
               <w:rPr>
-                <w:rFonts w:ascii="宋体" w:hAnsi="宋体"/>
+                <w:rFonts w:ascii="宋体" w:hAnsi="宋体" w:hint="eastAsia"/>
                 <w:b/>
                 <w:bCs/>
                 <w:lang w:eastAsia="zh-CN"/>
@@ -12545,7 +12774,7 @@
             <w:pPr>
               <w:spacing w:after="40"/>
               <w:rPr>
-                <w:rFonts w:ascii="宋体" w:hAnsi="宋体"/>
+                <w:rFonts w:ascii="宋体" w:hAnsi="宋体" w:hint="eastAsia"/>
                 <w:b/>
                 <w:bCs/>
                 <w:lang w:eastAsia="zh-CN"/>
@@ -12576,7 +12805,7 @@
             <w:pPr>
               <w:spacing w:after="40"/>
               <w:rPr>
-                <w:rFonts w:ascii="宋体" w:hAnsi="宋体"/>
+                <w:rFonts w:ascii="宋体" w:hAnsi="宋体" w:hint="eastAsia"/>
                 <w:b/>
                 <w:bCs/>
                 <w:lang w:eastAsia="zh-CN"/>
@@ -12607,7 +12836,7 @@
             <w:pPr>
               <w:spacing w:after="40"/>
               <w:rPr>
-                <w:rFonts w:ascii="宋体" w:hAnsi="宋体"/>
+                <w:rFonts w:ascii="宋体" w:hAnsi="宋体" w:hint="eastAsia"/>
                 <w:b/>
                 <w:bCs/>
                 <w:lang w:eastAsia="zh-CN"/>
@@ -12638,7 +12867,7 @@
             <w:pPr>
               <w:spacing w:after="40"/>
               <w:rPr>
-                <w:rFonts w:ascii="宋体" w:hAnsi="宋体"/>
+                <w:rFonts w:ascii="宋体" w:hAnsi="宋体" w:hint="eastAsia"/>
                 <w:b/>
                 <w:bCs/>
                 <w:lang w:eastAsia="zh-CN"/>
@@ -12669,7 +12898,7 @@
             <w:pPr>
               <w:spacing w:after="40"/>
               <w:rPr>
-                <w:rFonts w:ascii="宋体" w:hAnsi="宋体"/>
+                <w:rFonts w:ascii="宋体" w:hAnsi="宋体" w:hint="eastAsia"/>
                 <w:b/>
                 <w:bCs/>
                 <w:lang w:eastAsia="zh-CN"/>
@@ -12701,7 +12930,7 @@
             <w:pPr>
               <w:spacing w:after="40"/>
               <w:rPr>
-                <w:rFonts w:ascii="宋体" w:hAnsi="宋体"/>
+                <w:rFonts w:ascii="宋体" w:hAnsi="宋体" w:hint="eastAsia"/>
                 <w:lang w:eastAsia="zh-CN"/>
               </w:rPr>
             </w:pPr>
@@ -12724,7 +12953,7 @@
             <w:pPr>
               <w:spacing w:after="40"/>
               <w:rPr>
-                <w:rFonts w:ascii="宋体" w:hAnsi="宋体"/>
+                <w:rFonts w:ascii="宋体" w:hAnsi="宋体" w:hint="eastAsia"/>
                 <w:lang w:eastAsia="zh-CN"/>
               </w:rPr>
             </w:pPr>
@@ -12740,7 +12969,7 @@
             <w:pPr>
               <w:spacing w:after="40"/>
               <w:rPr>
-                <w:rFonts w:ascii="宋体" w:hAnsi="宋体"/>
+                <w:rFonts w:ascii="宋体" w:hAnsi="宋体" w:hint="eastAsia"/>
                 <w:lang w:eastAsia="zh-CN"/>
               </w:rPr>
             </w:pPr>
@@ -12756,7 +12985,7 @@
             <w:pPr>
               <w:spacing w:after="40"/>
               <w:rPr>
-                <w:rFonts w:ascii="宋体" w:hAnsi="宋体"/>
+                <w:rFonts w:ascii="宋体" w:hAnsi="宋体" w:hint="eastAsia"/>
                 <w:lang w:eastAsia="zh-CN"/>
               </w:rPr>
             </w:pPr>
@@ -12772,7 +13001,7 @@
             <w:pPr>
               <w:spacing w:after="40"/>
               <w:rPr>
-                <w:rFonts w:ascii="宋体" w:hAnsi="宋体"/>
+                <w:rFonts w:ascii="宋体" w:hAnsi="宋体" w:hint="eastAsia"/>
                 <w:lang w:eastAsia="zh-CN"/>
               </w:rPr>
             </w:pPr>
@@ -12788,7 +13017,7 @@
             <w:pPr>
               <w:spacing w:after="40"/>
               <w:rPr>
-                <w:rFonts w:ascii="宋体" w:hAnsi="宋体"/>
+                <w:rFonts w:ascii="宋体" w:hAnsi="宋体" w:hint="eastAsia"/>
                 <w:lang w:eastAsia="zh-CN"/>
               </w:rPr>
             </w:pPr>
@@ -12804,7 +13033,7 @@
             <w:pPr>
               <w:spacing w:after="40"/>
               <w:rPr>
-                <w:rFonts w:ascii="宋体" w:hAnsi="宋体"/>
+                <w:rFonts w:ascii="宋体" w:hAnsi="宋体" w:hint="eastAsia"/>
                 <w:lang w:eastAsia="zh-CN"/>
               </w:rPr>
             </w:pPr>
@@ -12820,7 +13049,7 @@
             <w:pPr>
               <w:spacing w:after="40"/>
               <w:rPr>
-                <w:rFonts w:ascii="宋体" w:hAnsi="宋体"/>
+                <w:rFonts w:ascii="宋体" w:hAnsi="宋体" w:hint="eastAsia"/>
                 <w:lang w:eastAsia="zh-CN"/>
               </w:rPr>
             </w:pPr>
@@ -12836,7 +13065,7 @@
             <w:pPr>
               <w:spacing w:after="40"/>
               <w:rPr>
-                <w:rFonts w:ascii="宋体" w:hAnsi="宋体"/>
+                <w:rFonts w:ascii="宋体" w:hAnsi="宋体" w:hint="eastAsia"/>
                 <w:lang w:eastAsia="zh-CN"/>
               </w:rPr>
             </w:pPr>
@@ -12852,7 +13081,7 @@
             <w:pPr>
               <w:spacing w:after="40"/>
               <w:rPr>
-                <w:rFonts w:ascii="宋体" w:hAnsi="宋体"/>
+                <w:rFonts w:ascii="宋体" w:hAnsi="宋体" w:hint="eastAsia"/>
                 <w:lang w:eastAsia="zh-CN"/>
               </w:rPr>
             </w:pPr>
@@ -12868,7 +13097,7 @@
             <w:pPr>
               <w:spacing w:after="40"/>
               <w:rPr>
-                <w:rFonts w:ascii="宋体" w:hAnsi="宋体"/>
+                <w:rFonts w:ascii="宋体" w:hAnsi="宋体" w:hint="eastAsia"/>
                 <w:lang w:eastAsia="zh-CN"/>
               </w:rPr>
             </w:pPr>
@@ -12884,7 +13113,7 @@
             <w:pPr>
               <w:spacing w:after="40"/>
               <w:rPr>
-                <w:rFonts w:ascii="宋体" w:hAnsi="宋体"/>
+                <w:rFonts w:ascii="宋体" w:hAnsi="宋体" w:hint="eastAsia"/>
                 <w:lang w:eastAsia="zh-CN"/>
               </w:rPr>
             </w:pPr>
@@ -12912,7 +13141,7 @@
             <w:pPr>
               <w:spacing w:after="40"/>
               <w:rPr>
-                <w:rFonts w:ascii="宋体" w:hAnsi="宋体"/>
+                <w:rFonts w:ascii="宋体" w:hAnsi="宋体" w:hint="eastAsia"/>
                 <w:lang w:eastAsia="zh-CN"/>
               </w:rPr>
             </w:pPr>
@@ -12935,7 +13164,7 @@
             <w:pPr>
               <w:spacing w:after="40"/>
               <w:rPr>
-                <w:rFonts w:ascii="宋体" w:hAnsi="宋体"/>
+                <w:rFonts w:ascii="宋体" w:hAnsi="宋体" w:hint="eastAsia"/>
                 <w:lang w:eastAsia="zh-CN"/>
               </w:rPr>
             </w:pPr>
@@ -12951,7 +13180,7 @@
             <w:pPr>
               <w:spacing w:after="40"/>
               <w:rPr>
-                <w:rFonts w:ascii="宋体" w:hAnsi="宋体"/>
+                <w:rFonts w:ascii="宋体" w:hAnsi="宋体" w:hint="eastAsia"/>
                 <w:lang w:eastAsia="zh-CN"/>
               </w:rPr>
             </w:pPr>
@@ -12967,7 +13196,7 @@
             <w:pPr>
               <w:spacing w:after="40"/>
               <w:rPr>
-                <w:rFonts w:ascii="宋体" w:hAnsi="宋体"/>
+                <w:rFonts w:ascii="宋体" w:hAnsi="宋体" w:hint="eastAsia"/>
                 <w:lang w:eastAsia="zh-CN"/>
               </w:rPr>
             </w:pPr>
@@ -12983,7 +13212,7 @@
             <w:pPr>
               <w:spacing w:after="40"/>
               <w:rPr>
-                <w:rFonts w:ascii="宋体" w:hAnsi="宋体"/>
+                <w:rFonts w:ascii="宋体" w:hAnsi="宋体" w:hint="eastAsia"/>
                 <w:lang w:eastAsia="zh-CN"/>
               </w:rPr>
             </w:pPr>
@@ -12999,7 +13228,7 @@
             <w:pPr>
               <w:spacing w:after="40"/>
               <w:rPr>
-                <w:rFonts w:ascii="宋体" w:hAnsi="宋体"/>
+                <w:rFonts w:ascii="宋体" w:hAnsi="宋体" w:hint="eastAsia"/>
                 <w:lang w:eastAsia="zh-CN"/>
               </w:rPr>
             </w:pPr>
@@ -13015,7 +13244,7 @@
             <w:pPr>
               <w:spacing w:after="40"/>
               <w:rPr>
-                <w:rFonts w:ascii="宋体" w:hAnsi="宋体"/>
+                <w:rFonts w:ascii="宋体" w:hAnsi="宋体" w:hint="eastAsia"/>
                 <w:lang w:eastAsia="zh-CN"/>
               </w:rPr>
             </w:pPr>
@@ -13031,7 +13260,7 @@
             <w:pPr>
               <w:spacing w:after="40"/>
               <w:rPr>
-                <w:rFonts w:ascii="宋体" w:hAnsi="宋体"/>
+                <w:rFonts w:ascii="宋体" w:hAnsi="宋体" w:hint="eastAsia"/>
                 <w:lang w:eastAsia="zh-CN"/>
               </w:rPr>
             </w:pPr>
@@ -13047,7 +13276,7 @@
             <w:pPr>
               <w:spacing w:after="40"/>
               <w:rPr>
-                <w:rFonts w:ascii="宋体" w:hAnsi="宋体"/>
+                <w:rFonts w:ascii="宋体" w:hAnsi="宋体" w:hint="eastAsia"/>
                 <w:lang w:eastAsia="zh-CN"/>
               </w:rPr>
             </w:pPr>
@@ -13063,7 +13292,7 @@
             <w:pPr>
               <w:spacing w:after="40"/>
               <w:rPr>
-                <w:rFonts w:ascii="宋体" w:hAnsi="宋体"/>
+                <w:rFonts w:ascii="宋体" w:hAnsi="宋体" w:hint="eastAsia"/>
                 <w:lang w:eastAsia="zh-CN"/>
               </w:rPr>
             </w:pPr>
@@ -13079,7 +13308,7 @@
             <w:pPr>
               <w:spacing w:after="40"/>
               <w:rPr>
-                <w:rFonts w:ascii="宋体" w:hAnsi="宋体"/>
+                <w:rFonts w:ascii="宋体" w:hAnsi="宋体" w:hint="eastAsia"/>
                 <w:lang w:eastAsia="zh-CN"/>
               </w:rPr>
             </w:pPr>
@@ -13095,7 +13324,7 @@
             <w:pPr>
               <w:spacing w:after="40"/>
               <w:rPr>
-                <w:rFonts w:ascii="宋体" w:hAnsi="宋体"/>
+                <w:rFonts w:ascii="宋体" w:hAnsi="宋体" w:hint="eastAsia"/>
                 <w:lang w:eastAsia="zh-CN"/>
               </w:rPr>
             </w:pPr>
@@ -13132,7 +13361,7 @@
             <w:pPr>
               <w:spacing w:after="40"/>
               <w:rPr>
-                <w:rFonts w:ascii="宋体" w:hAnsi="宋体"/>
+                <w:rFonts w:ascii="宋体" w:hAnsi="宋体" w:hint="eastAsia"/>
                 <w:lang w:eastAsia="zh-CN"/>
               </w:rPr>
             </w:pPr>
@@ -13164,7 +13393,7 @@
             <w:pPr>
               <w:spacing w:after="40"/>
               <w:rPr>
-                <w:rFonts w:ascii="宋体" w:hAnsi="宋体"/>
+                <w:rFonts w:ascii="宋体" w:hAnsi="宋体" w:hint="eastAsia"/>
                 <w:lang w:eastAsia="zh-CN"/>
               </w:rPr>
             </w:pPr>
@@ -13180,7 +13409,7 @@
             <w:pPr>
               <w:spacing w:after="40"/>
               <w:rPr>
-                <w:rFonts w:ascii="宋体" w:hAnsi="宋体"/>
+                <w:rFonts w:ascii="宋体" w:hAnsi="宋体" w:hint="eastAsia"/>
                 <w:lang w:eastAsia="zh-CN"/>
               </w:rPr>
             </w:pPr>
@@ -13196,7 +13425,7 @@
             <w:pPr>
               <w:spacing w:after="40"/>
               <w:rPr>
-                <w:rFonts w:ascii="宋体" w:hAnsi="宋体"/>
+                <w:rFonts w:ascii="宋体" w:hAnsi="宋体" w:hint="eastAsia"/>
                 <w:lang w:eastAsia="zh-CN"/>
               </w:rPr>
             </w:pPr>
@@ -13212,7 +13441,7 @@
             <w:pPr>
               <w:spacing w:after="40"/>
               <w:rPr>
-                <w:rFonts w:ascii="宋体" w:hAnsi="宋体"/>
+                <w:rFonts w:ascii="宋体" w:hAnsi="宋体" w:hint="eastAsia"/>
                 <w:lang w:eastAsia="zh-CN"/>
               </w:rPr>
             </w:pPr>
@@ -13228,7 +13457,7 @@
             <w:pPr>
               <w:spacing w:after="40"/>
               <w:rPr>
-                <w:rFonts w:ascii="宋体" w:hAnsi="宋体"/>
+                <w:rFonts w:ascii="宋体" w:hAnsi="宋体" w:hint="eastAsia"/>
                 <w:lang w:eastAsia="zh-CN"/>
               </w:rPr>
             </w:pPr>
@@ -13244,7 +13473,7 @@
             <w:pPr>
               <w:spacing w:after="40"/>
               <w:rPr>
-                <w:rFonts w:ascii="宋体" w:hAnsi="宋体"/>
+                <w:rFonts w:ascii="宋体" w:hAnsi="宋体" w:hint="eastAsia"/>
                 <w:lang w:eastAsia="zh-CN"/>
               </w:rPr>
             </w:pPr>
@@ -13260,7 +13489,7 @@
             <w:pPr>
               <w:spacing w:after="40"/>
               <w:rPr>
-                <w:rFonts w:ascii="宋体" w:hAnsi="宋体"/>
+                <w:rFonts w:ascii="宋体" w:hAnsi="宋体" w:hint="eastAsia"/>
                 <w:lang w:eastAsia="zh-CN"/>
               </w:rPr>
             </w:pPr>
@@ -13276,7 +13505,7 @@
             <w:pPr>
               <w:spacing w:after="40"/>
               <w:rPr>
-                <w:rFonts w:ascii="宋体" w:hAnsi="宋体"/>
+                <w:rFonts w:ascii="宋体" w:hAnsi="宋体" w:hint="eastAsia"/>
                 <w:lang w:eastAsia="zh-CN"/>
               </w:rPr>
             </w:pPr>
@@ -13292,7 +13521,7 @@
             <w:pPr>
               <w:spacing w:after="40"/>
               <w:rPr>
-                <w:rFonts w:ascii="宋体" w:hAnsi="宋体"/>
+                <w:rFonts w:ascii="宋体" w:hAnsi="宋体" w:hint="eastAsia"/>
                 <w:lang w:eastAsia="zh-CN"/>
               </w:rPr>
             </w:pPr>
@@ -13308,7 +13537,7 @@
             <w:pPr>
               <w:spacing w:after="40"/>
               <w:rPr>
-                <w:rFonts w:ascii="宋体" w:hAnsi="宋体"/>
+                <w:rFonts w:ascii="宋体" w:hAnsi="宋体" w:hint="eastAsia"/>
                 <w:lang w:eastAsia="zh-CN"/>
               </w:rPr>
             </w:pPr>
@@ -13324,7 +13553,7 @@
             <w:pPr>
               <w:spacing w:after="40"/>
               <w:rPr>
-                <w:rFonts w:ascii="宋体" w:hAnsi="宋体"/>
+                <w:rFonts w:ascii="宋体" w:hAnsi="宋体" w:hint="eastAsia"/>
                 <w:lang w:eastAsia="zh-CN"/>
               </w:rPr>
             </w:pPr>
@@ -13352,7 +13581,7 @@
             <w:pPr>
               <w:spacing w:after="40"/>
               <w:rPr>
-                <w:rFonts w:ascii="宋体" w:hAnsi="宋体"/>
+                <w:rFonts w:ascii="宋体" w:hAnsi="宋体" w:hint="eastAsia"/>
                 <w:lang w:eastAsia="zh-CN"/>
               </w:rPr>
             </w:pPr>
@@ -13375,7 +13604,7 @@
             <w:pPr>
               <w:spacing w:after="40"/>
               <w:rPr>
-                <w:rFonts w:ascii="宋体" w:hAnsi="宋体"/>
+                <w:rFonts w:ascii="宋体" w:hAnsi="宋体" w:hint="eastAsia"/>
                 <w:lang w:eastAsia="zh-CN"/>
               </w:rPr>
             </w:pPr>
@@ -13391,7 +13620,7 @@
             <w:pPr>
               <w:spacing w:after="40"/>
               <w:rPr>
-                <w:rFonts w:ascii="宋体" w:hAnsi="宋体"/>
+                <w:rFonts w:ascii="宋体" w:hAnsi="宋体" w:hint="eastAsia"/>
                 <w:lang w:eastAsia="zh-CN"/>
               </w:rPr>
             </w:pPr>
@@ -13407,7 +13636,7 @@
             <w:pPr>
               <w:spacing w:after="40"/>
               <w:rPr>
-                <w:rFonts w:ascii="宋体" w:hAnsi="宋体"/>
+                <w:rFonts w:ascii="宋体" w:hAnsi="宋体" w:hint="eastAsia"/>
                 <w:lang w:eastAsia="zh-CN"/>
               </w:rPr>
             </w:pPr>
@@ -13423,7 +13652,7 @@
             <w:pPr>
               <w:spacing w:after="40"/>
               <w:rPr>
-                <w:rFonts w:ascii="宋体" w:hAnsi="宋体"/>
+                <w:rFonts w:ascii="宋体" w:hAnsi="宋体" w:hint="eastAsia"/>
                 <w:lang w:eastAsia="zh-CN"/>
               </w:rPr>
             </w:pPr>
@@ -13439,7 +13668,7 @@
             <w:pPr>
               <w:spacing w:after="40"/>
               <w:rPr>
-                <w:rFonts w:ascii="宋体" w:hAnsi="宋体"/>
+                <w:rFonts w:ascii="宋体" w:hAnsi="宋体" w:hint="eastAsia"/>
                 <w:lang w:eastAsia="zh-CN"/>
               </w:rPr>
             </w:pPr>
@@ -13455,7 +13684,7 @@
             <w:pPr>
               <w:spacing w:after="40"/>
               <w:rPr>
-                <w:rFonts w:ascii="宋体" w:hAnsi="宋体"/>
+                <w:rFonts w:ascii="宋体" w:hAnsi="宋体" w:hint="eastAsia"/>
                 <w:lang w:eastAsia="zh-CN"/>
               </w:rPr>
             </w:pPr>
@@ -13471,7 +13700,7 @@
             <w:pPr>
               <w:spacing w:after="40"/>
               <w:rPr>
-                <w:rFonts w:ascii="宋体" w:hAnsi="宋体"/>
+                <w:rFonts w:ascii="宋体" w:hAnsi="宋体" w:hint="eastAsia"/>
                 <w:lang w:eastAsia="zh-CN"/>
               </w:rPr>
             </w:pPr>
@@ -13487,7 +13716,7 @@
             <w:pPr>
               <w:spacing w:after="40"/>
               <w:rPr>
-                <w:rFonts w:ascii="宋体" w:hAnsi="宋体"/>
+                <w:rFonts w:ascii="宋体" w:hAnsi="宋体" w:hint="eastAsia"/>
                 <w:lang w:eastAsia="zh-CN"/>
               </w:rPr>
             </w:pPr>
@@ -13503,7 +13732,7 @@
             <w:pPr>
               <w:spacing w:after="40"/>
               <w:rPr>
-                <w:rFonts w:ascii="宋体" w:hAnsi="宋体"/>
+                <w:rFonts w:ascii="宋体" w:hAnsi="宋体" w:hint="eastAsia"/>
                 <w:lang w:eastAsia="zh-CN"/>
               </w:rPr>
             </w:pPr>
@@ -13519,7 +13748,7 @@
             <w:pPr>
               <w:spacing w:after="40"/>
               <w:rPr>
-                <w:rFonts w:ascii="宋体" w:hAnsi="宋体"/>
+                <w:rFonts w:ascii="宋体" w:hAnsi="宋体" w:hint="eastAsia"/>
                 <w:lang w:eastAsia="zh-CN"/>
               </w:rPr>
             </w:pPr>
@@ -13535,7 +13764,7 @@
             <w:pPr>
               <w:spacing w:after="40"/>
               <w:rPr>
-                <w:rFonts w:ascii="宋体" w:hAnsi="宋体"/>
+                <w:rFonts w:ascii="宋体" w:hAnsi="宋体" w:hint="eastAsia"/>
                 <w:lang w:eastAsia="zh-CN"/>
               </w:rPr>
             </w:pPr>
@@ -13563,7 +13792,6 @@
       <w:pPr>
         <w:pStyle w:val="21"/>
         <w:rPr>
-          <w:rFonts w:hint="eastAsia"/>
           <w:lang w:eastAsia="zh-CN"/>
         </w:rPr>
       </w:pPr>
@@ -13601,7 +13829,15 @@
           <w:rFonts w:ascii="宋体" w:hAnsi="宋体"/>
           <w:lang w:eastAsia="zh-CN"/>
         </w:rPr>
-        <w:t>本文方法的重要特点之一，在于不把采区规划的几何布局视为终点，而是强调规划结果在采掘接续和工程经济评价环节中的持续传递。传统流程中，规划、接续与经济分析往往属于相互割裂的阶段性工作，空间布局结果需要经过人工转抄、再次建模或经验解释后才能进入下游环节，既增加重复劳动，也削弱了中间结果的可复用性。研究区样例表明，本文生成的工作面和巷道对象已经能够继续进入接续分析和经济评价过程，从而形成由空间对象到生产组织对象的连续传递链。</w:t>
+        <w:t>本文方法的重要特点之一，在于不把采区规划的几何布局视为终点，而是强调规划结果在采掘接续和工程经济评价环节中的持续传递。传统流程中，规划、接续与经济分析往往属于相互割裂的阶段性工作，空间布局结果需要经过人工转抄、再次建模或经验解释后才能进入下游环节，既增加重复劳动，也削弱了中间结果的可</w:t>
+      </w:r>
+      <w:r>
+        <w:rPr>
+          <w:rFonts w:ascii="宋体" w:hAnsi="宋体"/>
+          <w:lang w:eastAsia="zh-CN"/>
+        </w:rPr>
+        <w:lastRenderedPageBreak/>
+        <w:t>复用性。研究区样例表明，本文生成的工作面和巷道对象已经能够继续进入接续分析和经济评价过程，从而形成由空间对象到生产组织对象的连续传递链。</w:t>
       </w:r>
     </w:p>
     <w:p>
@@ -13642,18 +13878,247 @@
         <w:jc w:val="center"/>
       </w:pPr>
       <w:r>
+        <w:rPr>
+          <w:noProof/>
+        </w:rPr>
         <w:drawing>
-          <wp:inline xmlns:a="http://schemas.openxmlformats.org/drawingml/2006/main" xmlns:pic="http://schemas.openxmlformats.org/drawingml/2006/picture">
+          <wp:inline distT="0" distB="0" distL="0" distR="0" wp14:anchorId="66170346" wp14:editId="1BE584C0">
             <wp:extent cx="5760000" cy="3239546"/>
+            <wp:effectExtent l="0" t="0" r="0" b="0"/>
             <wp:docPr id="13" name="Picture 13"/>
             <wp:cNvGraphicFramePr>
-              <a:graphicFrameLocks noChangeAspect="1"/>
+              <a:graphicFrameLocks xmlns:a="http://schemas.openxmlformats.org/drawingml/2006/main" noChangeAspect="1"/>
             </wp:cNvGraphicFramePr>
-            <a:graphic>
+            <a:graphic xmlns:a="http://schemas.openxmlformats.org/drawingml/2006/main">
               <a:graphicData uri="http://schemas.openxmlformats.org/drawingml/2006/picture">
-                <pic:pic>
+                <pic:pic xmlns:pic="http://schemas.openxmlformats.org/drawingml/2006/picture">
                   <pic:nvPicPr>
                     <pic:cNvPr id="0" name="08-采掘接续时序安排图.png"/>
+                    <pic:cNvPicPr/>
+                  </pic:nvPicPr>
+                  <pic:blipFill>
+                    <a:blip r:embed="rId16"/>
+                    <a:stretch>
+                      <a:fillRect/>
+                    </a:stretch>
+                  </pic:blipFill>
+                  <pic:spPr>
+                    <a:xfrm>
+                      <a:off x="0" y="0"/>
+                      <a:ext cx="5760000" cy="3239546"/>
+                    </a:xfrm>
+                    <a:prstGeom prst="rect">
+                      <a:avLst/>
+                    </a:prstGeom>
+                  </pic:spPr>
+                </pic:pic>
+              </a:graphicData>
+            </a:graphic>
+          </wp:inline>
+        </w:drawing>
+      </w:r>
+    </w:p>
+    <w:p>
+      <w:pPr>
+        <w:jc w:val="center"/>
+        <w:rPr>
+          <w:lang w:eastAsia="zh-CN"/>
+        </w:rPr>
+      </w:pPr>
+      <w:r>
+        <w:rPr>
+          <w:lang w:eastAsia="zh-CN"/>
+        </w:rPr>
+        <w:t>图</w:t>
+      </w:r>
+      <w:r>
+        <w:rPr>
+          <w:lang w:eastAsia="zh-CN"/>
+        </w:rPr>
+        <w:t xml:space="preserve">8 </w:t>
+      </w:r>
+      <w:r>
+        <w:rPr>
+          <w:lang w:eastAsia="zh-CN"/>
+        </w:rPr>
+        <w:t>采掘接续时序安排图</w:t>
+      </w:r>
+    </w:p>
+    <w:p>
+      <w:pPr>
+        <w:spacing w:after="40"/>
+        <w:ind w:firstLine="420"/>
+        <w:rPr>
+          <w:rFonts w:ascii="宋体" w:hAnsi="宋体" w:hint="eastAsia"/>
+          <w:lang w:eastAsia="zh-CN"/>
+        </w:rPr>
+      </w:pPr>
+      <w:r>
+        <w:rPr>
+          <w:rFonts w:ascii="宋体" w:hAnsi="宋体"/>
+          <w:lang w:eastAsia="zh-CN"/>
+        </w:rPr>
+        <w:t>在调控层面，规划结果还可进一步转化为工作面级控制变量，并通过采高、工作面宽度或区段煤柱等参数的调整，观察 ODI 统计指标及风险暴露程度的变化。当前分析表明，</w:t>
+      </w:r>
+      <w:proofErr w:type="gramStart"/>
+      <w:r>
+        <w:rPr>
+          <w:rFonts w:ascii="宋体" w:hAnsi="宋体"/>
+          <w:lang w:eastAsia="zh-CN"/>
+        </w:rPr>
+        <w:t>在续采工作面</w:t>
+      </w:r>
+      <w:proofErr w:type="gramEnd"/>
+      <w:r>
+        <w:rPr>
+          <w:rFonts w:ascii="宋体" w:hAnsi="宋体"/>
+          <w:lang w:eastAsia="zh-CN"/>
+        </w:rPr>
+        <w:t>调控过程中，采高降低能够显著压低 ODI 均值及</w:t>
+      </w:r>
+      <w:proofErr w:type="gramStart"/>
+      <w:r>
+        <w:rPr>
+          <w:rFonts w:ascii="宋体" w:hAnsi="宋体"/>
+          <w:lang w:eastAsia="zh-CN"/>
+        </w:rPr>
+        <w:t>高分位</w:t>
+      </w:r>
+      <w:proofErr w:type="gramEnd"/>
+      <w:r>
+        <w:rPr>
+          <w:rFonts w:ascii="宋体" w:hAnsi="宋体"/>
+          <w:lang w:eastAsia="zh-CN"/>
+        </w:rPr>
+        <w:t>统计量，这说明规划结果不仅能够被动进入后续评价环节，还能够主动支撑参数调控与局部优化。由此，规划阶段形成的空间对象不再是不可更改的静态结果，而是可围绕风险控制目标进一步优化的决策基础。</w:t>
+      </w:r>
+    </w:p>
+    <w:p>
+      <w:pPr>
+        <w:jc w:val="center"/>
+      </w:pPr>
+      <w:r>
+        <w:rPr>
+          <w:noProof/>
+        </w:rPr>
+        <w:lastRenderedPageBreak/>
+        <w:drawing>
+          <wp:inline distT="0" distB="0" distL="0" distR="0" wp14:anchorId="4F2277F1" wp14:editId="7860293F">
+            <wp:extent cx="5616000" cy="2927685"/>
+            <wp:effectExtent l="0" t="0" r="0" b="0"/>
+            <wp:docPr id="14" name="Picture 14"/>
+            <wp:cNvGraphicFramePr>
+              <a:graphicFrameLocks xmlns:a="http://schemas.openxmlformats.org/drawingml/2006/main" noChangeAspect="1"/>
+            </wp:cNvGraphicFramePr>
+            <a:graphic xmlns:a="http://schemas.openxmlformats.org/drawingml/2006/main">
+              <a:graphicData uri="http://schemas.openxmlformats.org/drawingml/2006/picture">
+                <pic:pic xmlns:pic="http://schemas.openxmlformats.org/drawingml/2006/picture">
+                  <pic:nvPicPr>
+                    <pic:cNvPr id="0" name="09-月产量变化曲线图.png"/>
+                    <pic:cNvPicPr/>
+                  </pic:nvPicPr>
+                  <pic:blipFill>
+                    <a:blip r:embed="rId17"/>
+                    <a:stretch>
+                      <a:fillRect/>
+                    </a:stretch>
+                  </pic:blipFill>
+                  <pic:spPr>
+                    <a:xfrm>
+                      <a:off x="0" y="0"/>
+                      <a:ext cx="5616000" cy="2927685"/>
+                    </a:xfrm>
+                    <a:prstGeom prst="rect">
+                      <a:avLst/>
+                    </a:prstGeom>
+                  </pic:spPr>
+                </pic:pic>
+              </a:graphicData>
+            </a:graphic>
+          </wp:inline>
+        </w:drawing>
+      </w:r>
+    </w:p>
+    <w:p>
+      <w:pPr>
+        <w:jc w:val="center"/>
+        <w:rPr>
+          <w:lang w:eastAsia="zh-CN"/>
+        </w:rPr>
+      </w:pPr>
+      <w:r>
+        <w:rPr>
+          <w:lang w:eastAsia="zh-CN"/>
+        </w:rPr>
+        <w:t>图</w:t>
+      </w:r>
+      <w:r>
+        <w:rPr>
+          <w:lang w:eastAsia="zh-CN"/>
+        </w:rPr>
+        <w:t xml:space="preserve">9 </w:t>
+      </w:r>
+      <w:r>
+        <w:rPr>
+          <w:lang w:eastAsia="zh-CN"/>
+        </w:rPr>
+        <w:t>月产量变化曲线图</w:t>
+      </w:r>
+    </w:p>
+    <w:p>
+      <w:pPr>
+        <w:spacing w:after="40"/>
+        <w:ind w:firstLine="420"/>
+        <w:rPr>
+          <w:rFonts w:ascii="宋体" w:hAnsi="宋体" w:hint="eastAsia"/>
+          <w:lang w:eastAsia="zh-CN"/>
+        </w:rPr>
+      </w:pPr>
+      <w:r>
+        <w:rPr>
+          <w:rFonts w:ascii="宋体" w:hAnsi="宋体"/>
+          <w:lang w:eastAsia="zh-CN"/>
+        </w:rPr>
+        <w:t>在工程经济评价层面，规划与接续结果可继续进入收入、成本、风险联动成本和净现值分析过程，形成从月度净现金流到综合经济指标的闭环。</w:t>
+      </w:r>
+      <w:proofErr w:type="gramStart"/>
+      <w:r>
+        <w:rPr>
+          <w:rFonts w:ascii="宋体" w:hAnsi="宋体"/>
+          <w:lang w:eastAsia="zh-CN"/>
+        </w:rPr>
+        <w:t>当前样</w:t>
+      </w:r>
+      <w:proofErr w:type="gramEnd"/>
+      <w:r>
+        <w:rPr>
+          <w:rFonts w:ascii="宋体" w:hAnsi="宋体"/>
+          <w:lang w:eastAsia="zh-CN"/>
+        </w:rPr>
+        <w:t>例虽然尚未形成真实矿井条件下的大样本经济对照结果，但已经建立了规划结果—接续组织—经济评价的传递逻辑，说明空间布局、风险约束与经济指标能够在统一链路内进行耦合。对于采区规划研究而言，这一点具有重要意义，因为它意味着规划结果不再只是局部几何解，而能够继续作为效益分析和方案比较的上游对象参与更长链条的工程决策。</w:t>
+      </w:r>
+    </w:p>
+    <w:p>
+      <w:pPr>
+        <w:jc w:val="center"/>
+      </w:pPr>
+      <w:r>
+        <w:rPr>
+          <w:noProof/>
+        </w:rPr>
+        <w:drawing>
+          <wp:inline distT="0" distB="0" distL="0" distR="0" wp14:anchorId="1C1B47C8" wp14:editId="5D9D7ABA">
+            <wp:extent cx="5688000" cy="2954936"/>
+            <wp:effectExtent l="0" t="0" r="0" b="0"/>
+            <wp:docPr id="15" name="Picture 15"/>
+            <wp:cNvGraphicFramePr>
+              <a:graphicFrameLocks xmlns:a="http://schemas.openxmlformats.org/drawingml/2006/main" noChangeAspect="1"/>
+            </wp:cNvGraphicFramePr>
+            <a:graphic xmlns:a="http://schemas.openxmlformats.org/drawingml/2006/main">
+              <a:graphicData uri="http://schemas.openxmlformats.org/drawingml/2006/picture">
+                <pic:pic xmlns:pic="http://schemas.openxmlformats.org/drawingml/2006/picture">
+                  <pic:nvPicPr>
+                    <pic:cNvPr id="0" name="10-采掘接续方案现金流分析图.png"/>
                     <pic:cNvPicPr/>
                   </pic:nvPicPr>
                   <pic:blipFill>
@@ -13665,9 +14130,11 @@
                   <pic:spPr>
                     <a:xfrm>
                       <a:off x="0" y="0"/>
-                      <a:ext cx="5760000" cy="3239546"/>
+                      <a:ext cx="5688000" cy="2954936"/>
                     </a:xfrm>
-                    <a:prstGeom prst="rect"/>
+                    <a:prstGeom prst="rect">
+                      <a:avLst/>
+                    </a:prstGeom>
                   </pic:spPr>
                 </pic:pic>
               </a:graphicData>
@@ -13679,13 +14146,27 @@
     <w:p>
       <w:pPr>
         <w:jc w:val="center"/>
+        <w:rPr>
+          <w:lang w:eastAsia="zh-CN"/>
+        </w:rPr>
       </w:pPr>
       <w:r>
         <w:rPr>
-          <w:b w:val="0"/>
-          <w:sz w:val="21"/>
-        </w:rPr>
-        <w:t>图8 采掘接续时序安排图</w:t>
+          <w:lang w:eastAsia="zh-CN"/>
+        </w:rPr>
+        <w:t>图</w:t>
+      </w:r>
+      <w:r>
+        <w:rPr>
+          <w:lang w:eastAsia="zh-CN"/>
+        </w:rPr>
+        <w:t xml:space="preserve">10 </w:t>
+      </w:r>
+      <w:r>
+        <w:rPr>
+          <w:lang w:eastAsia="zh-CN"/>
+        </w:rPr>
+        <w:t>采掘接续方案现金流分析图</w:t>
       </w:r>
     </w:p>
     <w:p>
@@ -13702,7 +14183,7 @@
           <w:rFonts w:ascii="宋体" w:hAnsi="宋体"/>
           <w:lang w:eastAsia="zh-CN"/>
         </w:rPr>
-        <w:t>在调控层面，规划结果还可进一步转化为工作面级控制变量，并通过采高、工作面宽度或区段煤柱等参数的调整，观察 ODI 统计指标及风险暴露程度的变化。当前分析表明，</w:t>
+        <w:t>综上，研究区案例表明，本文提出的方法已经能够实现“采区边界与钻孔导入—连续参数场构建—多场景 ODI 风险组织—候选规划生成—采掘接续与工程经济评价传递”的连续运行过程。其核心价值不在于证明某一单独模块的局部性能，而在于说明边界、钻孔、参数场、</w:t>
       </w:r>
       <w:proofErr w:type="gramStart"/>
       <w:r>
@@ -13710,7 +14191,7 @@
           <w:rFonts w:ascii="宋体" w:hAnsi="宋体"/>
           <w:lang w:eastAsia="zh-CN"/>
         </w:rPr>
-        <w:t>在续采工作面</w:t>
+        <w:t>风险场</w:t>
       </w:r>
       <w:proofErr w:type="gramEnd"/>
       <w:r>
@@ -13718,192 +14199,15 @@
           <w:rFonts w:ascii="宋体" w:hAnsi="宋体"/>
           <w:lang w:eastAsia="zh-CN"/>
         </w:rPr>
-        <w:t>调控过程中，采高降低能够显著压低 ODI 均值及</w:t>
-      </w:r>
-      <w:proofErr w:type="gramStart"/>
+        <w:t>和规划对象之间已经形成可传递、可比较、可</w:t>
+      </w:r>
       <w:r>
         <w:rPr>
           <w:rFonts w:ascii="宋体" w:hAnsi="宋体"/>
           <w:lang w:eastAsia="zh-CN"/>
         </w:rPr>
-        <w:t>高分位</w:t>
-      </w:r>
-      <w:proofErr w:type="gramEnd"/>
-      <w:r>
-        <w:rPr>
-          <w:rFonts w:ascii="宋体" w:hAnsi="宋体"/>
-          <w:lang w:eastAsia="zh-CN"/>
-        </w:rPr>
-        <w:t>统计量，这说明规划结果不仅能够被动进入后续评价环节，还能够主动支撑参数调控与局部优化。由此，规划阶段形成的空间对象不再是不可更改的静态结果，而是可围绕风险控制目标进一步优化的决策基础。</w:t>
-      </w:r>
-    </w:p>
-    <w:p>
-      <w:pPr>
-        <w:jc w:val="center"/>
-      </w:pPr>
-      <w:r>
-        <w:drawing>
-          <wp:inline xmlns:a="http://schemas.openxmlformats.org/drawingml/2006/main" xmlns:pic="http://schemas.openxmlformats.org/drawingml/2006/picture">
-            <wp:extent cx="5616000" cy="2927685"/>
-            <wp:docPr id="14" name="Picture 14"/>
-            <wp:cNvGraphicFramePr>
-              <a:graphicFrameLocks noChangeAspect="1"/>
-            </wp:cNvGraphicFramePr>
-            <a:graphic>
-              <a:graphicData uri="http://schemas.openxmlformats.org/drawingml/2006/picture">
-                <pic:pic>
-                  <pic:nvPicPr>
-                    <pic:cNvPr id="0" name="09-月产量变化曲线图.png"/>
-                    <pic:cNvPicPr/>
-                  </pic:nvPicPr>
-                  <pic:blipFill>
-                    <a:blip r:embed="rId19"/>
-                    <a:stretch>
-                      <a:fillRect/>
-                    </a:stretch>
-                  </pic:blipFill>
-                  <pic:spPr>
-                    <a:xfrm>
-                      <a:off x="0" y="0"/>
-                      <a:ext cx="5616000" cy="2927685"/>
-                    </a:xfrm>
-                    <a:prstGeom prst="rect"/>
-                  </pic:spPr>
-                </pic:pic>
-              </a:graphicData>
-            </a:graphic>
-          </wp:inline>
-        </w:drawing>
-      </w:r>
-    </w:p>
-    <w:p>
-      <w:pPr>
-        <w:jc w:val="center"/>
-      </w:pPr>
-      <w:r>
-        <w:rPr>
-          <w:b w:val="0"/>
-          <w:sz w:val="21"/>
-        </w:rPr>
-        <w:t>图9 月产量变化曲线图</w:t>
-      </w:r>
-    </w:p>
-    <w:p>
-      <w:pPr>
-        <w:spacing w:after="40"/>
-        <w:ind w:firstLine="420"/>
-        <w:rPr>
-          <w:rFonts w:ascii="宋体" w:hAnsi="宋体" w:hint="eastAsia"/>
-          <w:lang w:eastAsia="zh-CN"/>
-        </w:rPr>
-      </w:pPr>
-      <w:r>
-        <w:rPr>
-          <w:rFonts w:ascii="宋体" w:hAnsi="宋体"/>
-          <w:lang w:eastAsia="zh-CN"/>
-        </w:rPr>
         <w:lastRenderedPageBreak/>
-        <w:t>在工程经济评价层面，规划与接续结果可继续进入收入、成本、风险联动成本和净现值分析过程，形成从月度净现金流到综合经济指标的闭环。</w:t>
-      </w:r>
-      <w:proofErr w:type="gramStart"/>
-      <w:r>
-        <w:rPr>
-          <w:rFonts w:ascii="宋体" w:hAnsi="宋体"/>
-          <w:lang w:eastAsia="zh-CN"/>
-        </w:rPr>
-        <w:t>当前样</w:t>
-      </w:r>
-      <w:proofErr w:type="gramEnd"/>
-      <w:r>
-        <w:rPr>
-          <w:rFonts w:ascii="宋体" w:hAnsi="宋体"/>
-          <w:lang w:eastAsia="zh-CN"/>
-        </w:rPr>
-        <w:t>例虽然尚未形成真实矿井条件下的大样本经济对照结果，但已经建立了规划结果—接续组织—经济评价的传递逻辑，说明空间布局、风险约束与经济指标能够在统一链路内进行耦合。对于采区规划研究而言，这一点具有重要意义，因为它意味着规划结果不再只是局部几何解，而能够继续作为效益分析和方案比较的上游对象参与更长链条的工程决策。</w:t>
-      </w:r>
-    </w:p>
-    <w:p>
-      <w:pPr>
-        <w:jc w:val="center"/>
-      </w:pPr>
-      <w:r>
-        <w:drawing>
-          <wp:inline xmlns:a="http://schemas.openxmlformats.org/drawingml/2006/main" xmlns:pic="http://schemas.openxmlformats.org/drawingml/2006/picture">
-            <wp:extent cx="5688000" cy="2954936"/>
-            <wp:docPr id="15" name="Picture 15"/>
-            <wp:cNvGraphicFramePr>
-              <a:graphicFrameLocks noChangeAspect="1"/>
-            </wp:cNvGraphicFramePr>
-            <a:graphic>
-              <a:graphicData uri="http://schemas.openxmlformats.org/drawingml/2006/picture">
-                <pic:pic>
-                  <pic:nvPicPr>
-                    <pic:cNvPr id="0" name="10-采掘接续方案现金流分析图.png"/>
-                    <pic:cNvPicPr/>
-                  </pic:nvPicPr>
-                  <pic:blipFill>
-                    <a:blip r:embed="rId20"/>
-                    <a:stretch>
-                      <a:fillRect/>
-                    </a:stretch>
-                  </pic:blipFill>
-                  <pic:spPr>
-                    <a:xfrm>
-                      <a:off x="0" y="0"/>
-                      <a:ext cx="5688000" cy="2954936"/>
-                    </a:xfrm>
-                    <a:prstGeom prst="rect"/>
-                  </pic:spPr>
-                </pic:pic>
-              </a:graphicData>
-            </a:graphic>
-          </wp:inline>
-        </w:drawing>
-      </w:r>
-    </w:p>
-    <w:p>
-      <w:pPr>
-        <w:jc w:val="center"/>
-      </w:pPr>
-      <w:r>
-        <w:rPr>
-          <w:b w:val="0"/>
-          <w:sz w:val="21"/>
-        </w:rPr>
-        <w:t>图10 采掘接续方案现金流分析图</w:t>
-      </w:r>
-    </w:p>
-    <w:p>
-      <w:pPr>
-        <w:spacing w:after="40"/>
-        <w:ind w:firstLine="420"/>
-        <w:rPr>
-          <w:rFonts w:ascii="宋体" w:hAnsi="宋体"/>
-          <w:lang w:eastAsia="zh-CN"/>
-        </w:rPr>
-      </w:pPr>
-      <w:r>
-        <w:rPr>
-          <w:rFonts w:ascii="宋体" w:hAnsi="宋体"/>
-          <w:lang w:eastAsia="zh-CN"/>
-        </w:rPr>
-        <w:t>综上，研究区案例表明，本文提出的方法已经能够实现“采区边界与钻孔导入—连续参数场构建—多场景 ODI 风险组织—候选规划生成—采掘接续与工程经济评价传递”的连续运行过程。其核心价值不在于证明某一单独模块的局部性能，而在于说明边界、钻孔、参数场、</w:t>
-      </w:r>
-      <w:proofErr w:type="gramStart"/>
-      <w:r>
-        <w:rPr>
-          <w:rFonts w:ascii="宋体" w:hAnsi="宋体"/>
-          <w:lang w:eastAsia="zh-CN"/>
-        </w:rPr>
-        <w:t>风险场</w:t>
-      </w:r>
-      <w:proofErr w:type="gramEnd"/>
-      <w:r>
-        <w:rPr>
-          <w:rFonts w:ascii="宋体" w:hAnsi="宋体"/>
-          <w:lang w:eastAsia="zh-CN"/>
-        </w:rPr>
-        <w:t>和规划对象之间已经形成可传递、可比较、可继续计算的统一对象链。需要同时说明的是，当前证据强度仍主要停留在</w:t>
+        <w:t>继续计算的统一对象链。需要同时说明的是，当前证据强度仍主要停留在</w:t>
       </w:r>
       <w:proofErr w:type="gramStart"/>
       <w:r>
@@ -14003,7 +14307,7 @@
               <w:spacing w:after="40"/>
               <w:jc w:val="center"/>
               <w:rPr>
-                <w:rFonts w:ascii="宋体" w:hAnsi="宋体"/>
+                <w:rFonts w:ascii="宋体" w:hAnsi="宋体" w:hint="eastAsia"/>
                 <w:b/>
                 <w:bCs/>
                 <w:lang w:eastAsia="zh-CN"/>
@@ -14035,7 +14339,7 @@
               <w:spacing w:after="40"/>
               <w:jc w:val="center"/>
               <w:rPr>
-                <w:rFonts w:ascii="宋体" w:hAnsi="宋体"/>
+                <w:rFonts w:ascii="宋体" w:hAnsi="宋体" w:hint="eastAsia"/>
                 <w:b/>
                 <w:bCs/>
                 <w:lang w:eastAsia="zh-CN"/>
@@ -14067,7 +14371,7 @@
               <w:spacing w:after="40"/>
               <w:jc w:val="center"/>
               <w:rPr>
-                <w:rFonts w:ascii="宋体" w:hAnsi="宋体"/>
+                <w:rFonts w:ascii="宋体" w:hAnsi="宋体" w:hint="eastAsia"/>
                 <w:b/>
                 <w:bCs/>
                 <w:lang w:eastAsia="zh-CN"/>
@@ -14099,7 +14403,7 @@
               <w:spacing w:after="40"/>
               <w:jc w:val="center"/>
               <w:rPr>
-                <w:rFonts w:ascii="宋体" w:hAnsi="宋体"/>
+                <w:rFonts w:ascii="宋体" w:hAnsi="宋体" w:hint="eastAsia"/>
                 <w:b/>
                 <w:bCs/>
                 <w:lang w:eastAsia="zh-CN"/>
@@ -14131,7 +14435,7 @@
               <w:spacing w:after="40"/>
               <w:jc w:val="center"/>
               <w:rPr>
-                <w:rFonts w:ascii="宋体" w:hAnsi="宋体"/>
+                <w:rFonts w:ascii="宋体" w:hAnsi="宋体" w:hint="eastAsia"/>
                 <w:b/>
                 <w:bCs/>
                 <w:lang w:eastAsia="zh-CN"/>
@@ -14163,7 +14467,7 @@
               <w:spacing w:after="40"/>
               <w:jc w:val="center"/>
               <w:rPr>
-                <w:rFonts w:ascii="宋体" w:hAnsi="宋体"/>
+                <w:rFonts w:ascii="宋体" w:hAnsi="宋体" w:hint="eastAsia"/>
                 <w:b/>
                 <w:bCs/>
                 <w:lang w:eastAsia="zh-CN"/>
@@ -14195,7 +14499,7 @@
               <w:spacing w:after="40"/>
               <w:jc w:val="center"/>
               <w:rPr>
-                <w:rFonts w:ascii="宋体" w:hAnsi="宋体"/>
+                <w:rFonts w:ascii="宋体" w:hAnsi="宋体" w:hint="eastAsia"/>
                 <w:b/>
                 <w:bCs/>
                 <w:lang w:eastAsia="zh-CN"/>
@@ -14229,7 +14533,7 @@
               <w:spacing w:after="40"/>
               <w:jc w:val="center"/>
               <w:rPr>
-                <w:rFonts w:ascii="宋体" w:hAnsi="宋体"/>
+                <w:rFonts w:ascii="宋体" w:hAnsi="宋体" w:hint="eastAsia"/>
                 <w:lang w:eastAsia="zh-CN"/>
               </w:rPr>
             </w:pPr>
@@ -14253,7 +14557,7 @@
               <w:spacing w:after="40"/>
               <w:jc w:val="center"/>
               <w:rPr>
-                <w:rFonts w:ascii="宋体" w:hAnsi="宋体"/>
+                <w:rFonts w:ascii="宋体" w:hAnsi="宋体" w:hint="eastAsia"/>
                 <w:lang w:eastAsia="zh-CN"/>
               </w:rPr>
             </w:pPr>
@@ -14270,7 +14574,7 @@
               <w:spacing w:after="40"/>
               <w:jc w:val="center"/>
               <w:rPr>
-                <w:rFonts w:ascii="宋体" w:hAnsi="宋体"/>
+                <w:rFonts w:ascii="宋体" w:hAnsi="宋体" w:hint="eastAsia"/>
                 <w:lang w:eastAsia="zh-CN"/>
               </w:rPr>
             </w:pPr>
@@ -14287,7 +14591,7 @@
               <w:spacing w:after="40"/>
               <w:jc w:val="center"/>
               <w:rPr>
-                <w:rFonts w:ascii="宋体" w:hAnsi="宋体"/>
+                <w:rFonts w:ascii="宋体" w:hAnsi="宋体" w:hint="eastAsia"/>
                 <w:lang w:eastAsia="zh-CN"/>
               </w:rPr>
             </w:pPr>
@@ -14304,7 +14608,7 @@
               <w:spacing w:after="40"/>
               <w:jc w:val="center"/>
               <w:rPr>
-                <w:rFonts w:ascii="宋体" w:hAnsi="宋体"/>
+                <w:rFonts w:ascii="宋体" w:hAnsi="宋体" w:hint="eastAsia"/>
                 <w:lang w:eastAsia="zh-CN"/>
               </w:rPr>
             </w:pPr>
@@ -14321,7 +14625,7 @@
               <w:spacing w:after="40"/>
               <w:jc w:val="center"/>
               <w:rPr>
-                <w:rFonts w:ascii="宋体" w:hAnsi="宋体"/>
+                <w:rFonts w:ascii="宋体" w:hAnsi="宋体" w:hint="eastAsia"/>
                 <w:lang w:eastAsia="zh-CN"/>
               </w:rPr>
             </w:pPr>
@@ -14338,7 +14642,7 @@
               <w:spacing w:after="40"/>
               <w:jc w:val="center"/>
               <w:rPr>
-                <w:rFonts w:ascii="宋体" w:hAnsi="宋体"/>
+                <w:rFonts w:ascii="宋体" w:hAnsi="宋体" w:hint="eastAsia"/>
                 <w:lang w:eastAsia="zh-CN"/>
               </w:rPr>
             </w:pPr>
@@ -14361,7 +14665,7 @@
               <w:spacing w:after="40"/>
               <w:jc w:val="center"/>
               <w:rPr>
-                <w:rFonts w:ascii="宋体" w:hAnsi="宋体"/>
+                <w:rFonts w:ascii="宋体" w:hAnsi="宋体" w:hint="eastAsia"/>
                 <w:lang w:eastAsia="zh-CN"/>
               </w:rPr>
             </w:pPr>
@@ -14385,7 +14689,7 @@
               <w:spacing w:after="40"/>
               <w:jc w:val="center"/>
               <w:rPr>
-                <w:rFonts w:ascii="宋体" w:hAnsi="宋体"/>
+                <w:rFonts w:ascii="宋体" w:hAnsi="宋体" w:hint="eastAsia"/>
                 <w:lang w:eastAsia="zh-CN"/>
               </w:rPr>
             </w:pPr>
@@ -14402,7 +14706,7 @@
               <w:spacing w:after="40"/>
               <w:jc w:val="center"/>
               <w:rPr>
-                <w:rFonts w:ascii="宋体" w:hAnsi="宋体"/>
+                <w:rFonts w:ascii="宋体" w:hAnsi="宋体" w:hint="eastAsia"/>
                 <w:lang w:eastAsia="zh-CN"/>
               </w:rPr>
             </w:pPr>
@@ -14419,7 +14723,7 @@
               <w:spacing w:after="40"/>
               <w:jc w:val="center"/>
               <w:rPr>
-                <w:rFonts w:ascii="宋体" w:hAnsi="宋体"/>
+                <w:rFonts w:ascii="宋体" w:hAnsi="宋体" w:hint="eastAsia"/>
                 <w:lang w:eastAsia="zh-CN"/>
               </w:rPr>
             </w:pPr>
@@ -14436,7 +14740,7 @@
               <w:spacing w:after="40"/>
               <w:jc w:val="center"/>
               <w:rPr>
-                <w:rFonts w:ascii="宋体" w:hAnsi="宋体"/>
+                <w:rFonts w:ascii="宋体" w:hAnsi="宋体" w:hint="eastAsia"/>
                 <w:lang w:eastAsia="zh-CN"/>
               </w:rPr>
             </w:pPr>
@@ -14453,7 +14757,7 @@
               <w:spacing w:after="40"/>
               <w:jc w:val="center"/>
               <w:rPr>
-                <w:rFonts w:ascii="宋体" w:hAnsi="宋体"/>
+                <w:rFonts w:ascii="宋体" w:hAnsi="宋体" w:hint="eastAsia"/>
                 <w:lang w:eastAsia="zh-CN"/>
               </w:rPr>
             </w:pPr>
@@ -14470,7 +14774,7 @@
               <w:spacing w:after="40"/>
               <w:jc w:val="center"/>
               <w:rPr>
-                <w:rFonts w:ascii="宋体" w:hAnsi="宋体"/>
+                <w:rFonts w:ascii="宋体" w:hAnsi="宋体" w:hint="eastAsia"/>
                 <w:lang w:eastAsia="zh-CN"/>
               </w:rPr>
             </w:pPr>
@@ -14493,7 +14797,7 @@
               <w:spacing w:after="40"/>
               <w:jc w:val="center"/>
               <w:rPr>
-                <w:rFonts w:ascii="宋体" w:hAnsi="宋体"/>
+                <w:rFonts w:ascii="宋体" w:hAnsi="宋体" w:hint="eastAsia"/>
                 <w:lang w:eastAsia="zh-CN"/>
               </w:rPr>
             </w:pPr>
@@ -14517,7 +14821,7 @@
               <w:spacing w:after="40"/>
               <w:jc w:val="center"/>
               <w:rPr>
-                <w:rFonts w:ascii="宋体" w:hAnsi="宋体"/>
+                <w:rFonts w:ascii="宋体" w:hAnsi="宋体" w:hint="eastAsia"/>
                 <w:lang w:eastAsia="zh-CN"/>
               </w:rPr>
             </w:pPr>
@@ -14534,7 +14838,7 @@
               <w:spacing w:after="40"/>
               <w:jc w:val="center"/>
               <w:rPr>
-                <w:rFonts w:ascii="宋体" w:hAnsi="宋体"/>
+                <w:rFonts w:ascii="宋体" w:hAnsi="宋体" w:hint="eastAsia"/>
                 <w:lang w:eastAsia="zh-CN"/>
               </w:rPr>
             </w:pPr>
@@ -14551,7 +14855,7 @@
               <w:spacing w:after="40"/>
               <w:jc w:val="center"/>
               <w:rPr>
-                <w:rFonts w:ascii="宋体" w:hAnsi="宋体"/>
+                <w:rFonts w:ascii="宋体" w:hAnsi="宋体" w:hint="eastAsia"/>
                 <w:lang w:eastAsia="zh-CN"/>
               </w:rPr>
             </w:pPr>
@@ -14568,7 +14872,7 @@
               <w:spacing w:after="40"/>
               <w:jc w:val="center"/>
               <w:rPr>
-                <w:rFonts w:ascii="宋体" w:hAnsi="宋体"/>
+                <w:rFonts w:ascii="宋体" w:hAnsi="宋体" w:hint="eastAsia"/>
                 <w:lang w:eastAsia="zh-CN"/>
               </w:rPr>
             </w:pPr>
@@ -14585,7 +14889,7 @@
               <w:spacing w:after="40"/>
               <w:jc w:val="center"/>
               <w:rPr>
-                <w:rFonts w:ascii="宋体" w:hAnsi="宋体"/>
+                <w:rFonts w:ascii="宋体" w:hAnsi="宋体" w:hint="eastAsia"/>
                 <w:lang w:eastAsia="zh-CN"/>
               </w:rPr>
             </w:pPr>
@@ -14602,7 +14906,7 @@
               <w:spacing w:after="40"/>
               <w:jc w:val="center"/>
               <w:rPr>
-                <w:rFonts w:ascii="宋体" w:hAnsi="宋体"/>
+                <w:rFonts w:ascii="宋体" w:hAnsi="宋体" w:hint="eastAsia"/>
                 <w:lang w:eastAsia="zh-CN"/>
               </w:rPr>
             </w:pPr>
@@ -14625,7 +14929,7 @@
               <w:spacing w:after="40"/>
               <w:jc w:val="center"/>
               <w:rPr>
-                <w:rFonts w:ascii="宋体" w:hAnsi="宋体"/>
+                <w:rFonts w:ascii="宋体" w:hAnsi="宋体" w:hint="eastAsia"/>
                 <w:lang w:eastAsia="zh-CN"/>
               </w:rPr>
             </w:pPr>
@@ -14649,7 +14953,7 @@
               <w:spacing w:after="40"/>
               <w:jc w:val="center"/>
               <w:rPr>
-                <w:rFonts w:ascii="宋体" w:hAnsi="宋体"/>
+                <w:rFonts w:ascii="宋体" w:hAnsi="宋体" w:hint="eastAsia"/>
                 <w:lang w:eastAsia="zh-CN"/>
               </w:rPr>
             </w:pPr>
@@ -14666,7 +14970,7 @@
               <w:spacing w:after="40"/>
               <w:jc w:val="center"/>
               <w:rPr>
-                <w:rFonts w:ascii="宋体" w:hAnsi="宋体"/>
+                <w:rFonts w:ascii="宋体" w:hAnsi="宋体" w:hint="eastAsia"/>
                 <w:lang w:eastAsia="zh-CN"/>
               </w:rPr>
             </w:pPr>
@@ -14683,7 +14987,7 @@
               <w:spacing w:after="40"/>
               <w:jc w:val="center"/>
               <w:rPr>
-                <w:rFonts w:ascii="宋体" w:hAnsi="宋体"/>
+                <w:rFonts w:ascii="宋体" w:hAnsi="宋体" w:hint="eastAsia"/>
                 <w:lang w:eastAsia="zh-CN"/>
               </w:rPr>
             </w:pPr>
@@ -14700,7 +15004,7 @@
               <w:spacing w:after="40"/>
               <w:jc w:val="center"/>
               <w:rPr>
-                <w:rFonts w:ascii="宋体" w:hAnsi="宋体"/>
+                <w:rFonts w:ascii="宋体" w:hAnsi="宋体" w:hint="eastAsia"/>
                 <w:lang w:eastAsia="zh-CN"/>
               </w:rPr>
             </w:pPr>
@@ -14717,7 +15021,7 @@
               <w:spacing w:after="40"/>
               <w:jc w:val="center"/>
               <w:rPr>
-                <w:rFonts w:ascii="宋体" w:hAnsi="宋体"/>
+                <w:rFonts w:ascii="宋体" w:hAnsi="宋体" w:hint="eastAsia"/>
                 <w:lang w:eastAsia="zh-CN"/>
               </w:rPr>
             </w:pPr>
@@ -14734,7 +15038,7 @@
               <w:spacing w:after="40"/>
               <w:jc w:val="center"/>
               <w:rPr>
-                <w:rFonts w:ascii="宋体" w:hAnsi="宋体"/>
+                <w:rFonts w:ascii="宋体" w:hAnsi="宋体" w:hint="eastAsia"/>
                 <w:lang w:eastAsia="zh-CN"/>
               </w:rPr>
             </w:pPr>
@@ -14757,7 +15061,7 @@
               <w:spacing w:after="40"/>
               <w:jc w:val="center"/>
               <w:rPr>
-                <w:rFonts w:ascii="宋体" w:hAnsi="宋体"/>
+                <w:rFonts w:ascii="宋体" w:hAnsi="宋体" w:hint="eastAsia"/>
                 <w:lang w:eastAsia="zh-CN"/>
               </w:rPr>
             </w:pPr>
@@ -14781,7 +15085,7 @@
               <w:spacing w:after="40"/>
               <w:jc w:val="center"/>
               <w:rPr>
-                <w:rFonts w:ascii="宋体" w:hAnsi="宋体"/>
+                <w:rFonts w:ascii="宋体" w:hAnsi="宋体" w:hint="eastAsia"/>
                 <w:lang w:eastAsia="zh-CN"/>
               </w:rPr>
             </w:pPr>
@@ -14798,7 +15102,7 @@
               <w:spacing w:after="40"/>
               <w:jc w:val="center"/>
               <w:rPr>
-                <w:rFonts w:ascii="宋体" w:hAnsi="宋体"/>
+                <w:rFonts w:ascii="宋体" w:hAnsi="宋体" w:hint="eastAsia"/>
                 <w:lang w:eastAsia="zh-CN"/>
               </w:rPr>
             </w:pPr>
@@ -14815,7 +15119,7 @@
               <w:spacing w:after="40"/>
               <w:jc w:val="center"/>
               <w:rPr>
-                <w:rFonts w:ascii="宋体" w:hAnsi="宋体"/>
+                <w:rFonts w:ascii="宋体" w:hAnsi="宋体" w:hint="eastAsia"/>
                 <w:lang w:eastAsia="zh-CN"/>
               </w:rPr>
             </w:pPr>
@@ -14832,7 +15136,7 @@
               <w:spacing w:after="40"/>
               <w:jc w:val="center"/>
               <w:rPr>
-                <w:rFonts w:ascii="宋体" w:hAnsi="宋体"/>
+                <w:rFonts w:ascii="宋体" w:hAnsi="宋体" w:hint="eastAsia"/>
                 <w:lang w:eastAsia="zh-CN"/>
               </w:rPr>
             </w:pPr>
@@ -14849,7 +15153,7 @@
               <w:spacing w:after="40"/>
               <w:jc w:val="center"/>
               <w:rPr>
-                <w:rFonts w:ascii="宋体" w:hAnsi="宋体"/>
+                <w:rFonts w:ascii="宋体" w:hAnsi="宋体" w:hint="eastAsia"/>
                 <w:lang w:eastAsia="zh-CN"/>
               </w:rPr>
             </w:pPr>
@@ -14866,7 +15170,7 @@
               <w:spacing w:after="40"/>
               <w:jc w:val="center"/>
               <w:rPr>
-                <w:rFonts w:ascii="宋体" w:hAnsi="宋体"/>
+                <w:rFonts w:ascii="宋体" w:hAnsi="宋体" w:hint="eastAsia"/>
                 <w:lang w:eastAsia="zh-CN"/>
               </w:rPr>
             </w:pPr>
@@ -15050,7 +15354,6 @@
           <w:rFonts w:hint="eastAsia"/>
           <w:lang w:eastAsia="zh-CN"/>
         </w:rPr>
-        <w:lastRenderedPageBreak/>
         <w:t>4</w:t>
       </w:r>
       <w:r>
@@ -15153,7 +15456,15 @@
           <w:rFonts w:ascii="宋体" w:hAnsi="宋体"/>
           <w:lang w:eastAsia="zh-CN"/>
         </w:rPr>
-        <w:t>提高了规划对象对地质条件的表达能力，也使多目标规划具备了更明确的空间基础。相比仅依据几何可布置性进行方案生成的方式，</w:t>
+        <w:t>提高了规划对象对地质条件的表达能力，也使多目标规</w:t>
+      </w:r>
+      <w:r>
+        <w:rPr>
+          <w:rFonts w:ascii="宋体" w:hAnsi="宋体"/>
+          <w:lang w:eastAsia="zh-CN"/>
+        </w:rPr>
+        <w:lastRenderedPageBreak/>
+        <w:t>划具备了更明确的空间基础。相比仅依据几何可布置性进行方案生成的方式，</w:t>
       </w:r>
       <w:proofErr w:type="gramStart"/>
       <w:r>
@@ -15550,7 +15861,6 @@
           <w:rFonts w:ascii="宋体" w:hAnsi="宋体"/>
           <w:lang w:eastAsia="zh-CN"/>
         </w:rPr>
-        <w:lastRenderedPageBreak/>
         <w:t>3）研究区样例验证表明，所提方法能够在统一空间参照与参数口径下完成采区边界约束处理、连续</w:t>
       </w:r>
       <w:proofErr w:type="gramStart"/>
@@ -15704,6 +16014,7 @@
           <w:rFonts w:ascii="宋体" w:hAnsi="宋体"/>
           <w:sz w:val="18"/>
         </w:rPr>
+        <w:lastRenderedPageBreak/>
         <w:t xml:space="preserve">[2] WANG </w:t>
       </w:r>
       <w:proofErr w:type="spellStart"/>
@@ -16155,7 +16466,6 @@
           <w:rFonts w:ascii="宋体" w:hAnsi="宋体"/>
           <w:sz w:val="18"/>
         </w:rPr>
-        <w:lastRenderedPageBreak/>
         <w:t>[15] PATHIRANAGE Ishara Hewa, NEUMANN Aneta. Multi-objective evolutionary optimization for large-scale open pit mine scheduling[C]//2024 IEEE Congress on Evolutionary Computation (CEC). 2024: 1-8. DOI: 10.1109/CEC60901.2024.10612008.</w:t>
       </w:r>
     </w:p>
@@ -16280,6 +16590,7 @@
           <w:rFonts w:ascii="宋体" w:hAnsi="宋体"/>
           <w:sz w:val="18"/>
         </w:rPr>
+        <w:lastRenderedPageBreak/>
         <w:t xml:space="preserve">[19] AHMED Haitham M., ADEWUYI </w:t>
       </w:r>
       <w:proofErr w:type="spellStart"/>
@@ -17362,6 +17673,7 @@
   <w:style w:type="character" w:default="1" w:styleId="a2">
     <w:name w:val="Default Paragraph Font"/>
     <w:uiPriority w:val="1"/>
+    <w:semiHidden/>
     <w:unhideWhenUsed/>
   </w:style>
   <w:style w:type="table" w:default="1" w:styleId="a3">

</xml_diff>